<commit_message>
Fix stale S1-S8 table references and replace outdated supplementary docx to match current S1-S6 submission
Co-Authored-By: Claude Sonnet 5 <noreply@anthropic.com>
</commit_message>
<xml_diff>
--- a/MONP_supplementary_material.docx
+++ b/MONP_supplementary_material.docx
@@ -8,6 +8,7 @@
       </w:pPr>
       <w:r>
         <w:rPr>
+          <w:rFonts w:ascii="Times New Roman" w:hAnsi="Times New Roman" w:cs="Times New Roman"/>
           <w:b/>
           <w:bCs/>
           <w:sz w:val="28"/>
@@ -32,12 +33,12 @@
           <w:sz w:val="24"/>
           <w:szCs w:val="24"/>
         </w:rPr>
-        <w:t>Apparent machine-learning performance in a metal-oxide nanoparticle cytotoxicity benchmark is driven by validation strategy and duplicate records</w:t>
+        <w:t>Validation strategy governs apparent machine-learning performance in metal-oxide nanoparticle cytotoxicity prediction</w:t>
       </w:r>
     </w:p>
     <w:p>
       <w:pPr>
-        <w:spacing w:before="240" w:after="80"/>
+        <w:spacing w:before="240" w:after="80" w:line="360" w:lineRule="auto"/>
         <w:jc w:val="both"/>
         <w:rPr>
           <w:rFonts w:ascii="Times New Roman" w:hAnsi="Times New Roman" w:cs="Times New Roman"/>
@@ -48,14 +49,18 @@
           <w:rFonts w:ascii="Times New Roman" w:hAnsi="Times New Roman" w:cs="Times New Roman"/>
           <w:b/>
           <w:bCs/>
+          <w:sz w:val="24"/>
+          <w:szCs w:val="24"/>
         </w:rPr>
         <w:t xml:space="preserve">Figure S1a. </w:t>
       </w:r>
       <w:r>
         <w:rPr>
           <w:rFonts w:ascii="Times New Roman" w:hAnsi="Times New Roman" w:cs="Times New Roman"/>
+          <w:sz w:val="24"/>
+          <w:szCs w:val="24"/>
         </w:rPr>
-        <w:t xml:space="preserve">Permutation null distribution of the leave-one-oxide-out MCC for the XGBoost model (1,000 label permutations). The observed value (solid line) lies within the 95% interval of the null distribution (dashed lines), consistent with the two-sided permutation p = 0.062.</w:t>
+        <w:t>Permutation null distribution of the leave-one-oxide-out MCC for the XGBoost model (1,000 label permutations). The observed XGBoost MCC (solid line) lay near the lower tail of the null distribution (dashed lines); the two-sided permutation test did not cross the conventional 0.05 threshold (p = 0.062).</w:t>
       </w:r>
     </w:p>
     <w:p>
@@ -65,6 +70,7 @@
       </w:pPr>
       <w:r>
         <w:rPr>
+          <w:rFonts w:ascii="Times New Roman" w:hAnsi="Times New Roman" w:cs="Times New Roman"/>
           <w:noProof/>
         </w:rPr>
         <w:drawing>
@@ -109,7 +115,7 @@
     </w:p>
     <w:p>
       <w:pPr>
-        <w:spacing w:before="240" w:after="80"/>
+        <w:spacing w:before="240" w:after="80" w:line="360" w:lineRule="auto"/>
         <w:jc w:val="both"/>
         <w:rPr>
           <w:rFonts w:ascii="Times New Roman" w:hAnsi="Times New Roman" w:cs="Times New Roman"/>
@@ -120,14 +126,17 @@
           <w:rFonts w:ascii="Times New Roman" w:hAnsi="Times New Roman" w:cs="Times New Roman"/>
           <w:b/>
           <w:bCs/>
+          <w:sz w:val="24"/>
+          <w:szCs w:val="24"/>
         </w:rPr>
-        <w:t xml:space="preserve">Figure S1b. </w:t>
+        <w:t>Figure S1b. Permutation null distribution of the leave-one-oxide-out MCC for the multilayer perceptron (1,000 label permutations). The observed value (solid line, +0.166) lies outside the displayed 95% interval of the empirical permutation null (dashed lines), consistent with the two-sided permutation p = 0.004. This supports a modest positive signal under the specified global-label permutation analysis; it does not by itself establish broad material-level transferability.</w:t>
       </w:r>
       <w:r>
         <w:rPr>
           <w:rFonts w:ascii="Times New Roman" w:hAnsi="Times New Roman" w:cs="Times New Roman"/>
+          <w:sz w:val="24"/>
+          <w:szCs w:val="24"/>
         </w:rPr>
-        <w:t xml:space="preserve">Permutation null distribution of the leave-one-oxide-out MCC for the multilayer perceptron (1,000 label permutations). The observed value (solid line, +0.166) lies well outside the 95% interval of the null distribution (dashed lines), consistent with the two-sided permutation p = 0.004. Unlike the XGBoost case (Figure S1a), the multilayer perceptron's observed score is clearly distinguishable from chance.</w:t>
       </w:r>
     </w:p>
     <w:p>
@@ -137,11 +146,12 @@
       </w:pPr>
       <w:r>
         <w:rPr>
+          <w:rFonts w:ascii="Times New Roman" w:hAnsi="Times New Roman" w:cs="Times New Roman"/>
           <w:noProof/>
         </w:rPr>
         <w:drawing>
           <wp:inline distT="0" distB="0" distL="0" distR="0" wp14:anchorId="0EB42BF8" wp14:editId="31077993">
-            <wp:extent cx="4095750" cy="2952750"/>
+            <wp:extent cx="4095750" cy="2956283"/>
             <wp:effectExtent l="0" t="0" r="0" b="0"/>
             <wp:docPr id="164480337" name="Picture 164480337"/>
             <wp:cNvGraphicFramePr>
@@ -166,7 +176,7 @@
                   <pic:spPr bwMode="auto">
                     <a:xfrm>
                       <a:off x="0" y="0"/>
-                      <a:ext cx="4095750" cy="2952750"/>
+                      <a:ext cx="4095750" cy="2956283"/>
                     </a:xfrm>
                     <a:prstGeom prst="rect">
                       <a:avLst/>
@@ -182,7 +192,7 @@
     <w:p/>
     <w:p>
       <w:pPr>
-        <w:spacing w:before="240" w:after="80"/>
+        <w:spacing w:before="240" w:after="80" w:line="360" w:lineRule="auto"/>
         <w:jc w:val="both"/>
         <w:rPr>
           <w:rFonts w:ascii="Times New Roman" w:hAnsi="Times New Roman" w:cs="Times New Roman"/>
@@ -193,12 +203,16 @@
           <w:rFonts w:ascii="Times New Roman" w:hAnsi="Times New Roman" w:cs="Times New Roman"/>
           <w:b/>
           <w:bCs/>
+          <w:sz w:val="24"/>
+          <w:szCs w:val="24"/>
         </w:rPr>
         <w:t xml:space="preserve">Figure S2. </w:t>
       </w:r>
       <w:r>
         <w:rPr>
           <w:rFonts w:ascii="Times New Roman" w:hAnsi="Times New Roman" w:cs="Times New Roman"/>
+          <w:sz w:val="24"/>
+          <w:szCs w:val="24"/>
         </w:rPr>
         <w:t xml:space="preserve">Per-oxide leave-one-oxide-out performance (full XGBoost model), with sample size (n) and number of cytotoxic instances annotated for each held-out oxide. Al₂O₃ and Fe₂O₃ folds are undefined (hatched) because the held-out set contains no cytotoxic instances. Per-oxide fold values are shown for transparency and are not interpreted or ranked against one another.</w:t>
       </w:r>
@@ -210,6 +224,7 @@
       </w:pPr>
       <w:r>
         <w:rPr>
+          <w:rFonts w:ascii="Times New Roman" w:hAnsi="Times New Roman" w:cs="Times New Roman"/>
           <w:noProof/>
         </w:rPr>
         <w:drawing>
@@ -254,7 +269,7 @@
     </w:p>
     <w:p>
       <w:pPr>
-        <w:spacing w:before="240" w:after="80"/>
+        <w:spacing w:before="240" w:after="80" w:line="360" w:lineRule="auto"/>
         <w:jc w:val="both"/>
         <w:rPr>
           <w:rFonts w:ascii="Times New Roman" w:hAnsi="Times New Roman" w:cs="Times New Roman"/>
@@ -265,12 +280,16 @@
           <w:rFonts w:ascii="Times New Roman" w:hAnsi="Times New Roman" w:cs="Times New Roman"/>
           <w:b/>
           <w:bCs/>
+          <w:sz w:val="24"/>
+          <w:szCs w:val="24"/>
         </w:rPr>
         <w:t xml:space="preserve">Figure S3. </w:t>
       </w:r>
       <w:r>
         <w:rPr>
           <w:rFonts w:ascii="Times New Roman" w:hAnsi="Times New Roman" w:cs="Times New Roman"/>
+          <w:sz w:val="24"/>
+          <w:szCs w:val="24"/>
         </w:rPr>
         <w:t xml:space="preserve">Effect of training-set material diversity on leave-one-oxide-out (LOMO) performance. Mean MCC is shown for the random forest and XGBoost as a function of the number of oxide classes included in the training set (2, 3, or 4 of the remaining oxides); shaded regions indicate variability across different oxide-class combinations (±1 SD). Although increasing material diversity was associated with improved mean performance, substantial variability remained—the bands span zero and rest on few combinations (only three oxides, ZnO, TiO₂, and CuO, provide defined test folds)—so this trend should be regarded as suggestive rather than statistically established, indicating that benchmark composition strongly influences apparent cross-material generalization.</w:t>
       </w:r>
@@ -282,6 +301,7 @@
       </w:pPr>
       <w:r>
         <w:rPr>
+          <w:rFonts w:ascii="Times New Roman" w:hAnsi="Times New Roman" w:cs="Times New Roman"/>
           <w:noProof/>
         </w:rPr>
         <w:drawing>
@@ -327,7 +347,7 @@
     <w:p/>
     <w:p>
       <w:pPr>
-        <w:spacing w:before="240" w:after="80"/>
+        <w:spacing w:before="240" w:after="80" w:line="360" w:lineRule="auto"/>
         <w:jc w:val="both"/>
         <w:rPr>
           <w:rFonts w:ascii="Times New Roman" w:hAnsi="Times New Roman" w:cs="Times New Roman"/>
@@ -338,14 +358,17 @@
           <w:rFonts w:ascii="Times New Roman" w:hAnsi="Times New Roman" w:cs="Times New Roman"/>
           <w:b/>
           <w:bCs/>
+          <w:sz w:val="24"/>
+          <w:szCs w:val="24"/>
         </w:rPr>
-        <w:t xml:space="preserve">Table S1. </w:t>
+        <w:t>Table S1. Validation-strategy curve. Random five-fold and leave-one-oxide-out (LOMO) MCC at nine duplication levels, with the validation-strategy gap defined as k-fold minus LOMO. Underlies Figure 1.</w:t>
       </w:r>
       <w:r>
         <w:rPr>
           <w:rFonts w:ascii="Times New Roman" w:hAnsi="Times New Roman" w:cs="Times New Roman"/>
+          <w:sz w:val="24"/>
+          <w:szCs w:val="24"/>
         </w:rPr>
-        <w:t>Leakage curve. Random five-fold and leave-one-oxide-out (LOMO) MCC at nine duplication levels, with the leakage gap (k-fold minus LOMO). Underlies Figure 1.</w:t>
       </w:r>
     </w:p>
     <w:tbl>
@@ -396,6 +419,7 @@
             </w:pPr>
             <w:r>
               <w:rPr>
+                <w:rFonts w:ascii="Times New Roman" w:hAnsi="Times New Roman" w:cs="Times New Roman"/>
                 <w:b/>
                 <w:bCs/>
                 <w:sz w:val="18"/>
@@ -428,6 +452,7 @@
             </w:pPr>
             <w:r>
               <w:rPr>
+                <w:rFonts w:ascii="Times New Roman" w:hAnsi="Times New Roman" w:cs="Times New Roman"/>
                 <w:b/>
                 <w:bCs/>
                 <w:sz w:val="18"/>
@@ -460,6 +485,7 @@
             </w:pPr>
             <w:r>
               <w:rPr>
+                <w:rFonts w:ascii="Times New Roman" w:hAnsi="Times New Roman" w:cs="Times New Roman"/>
                 <w:b/>
                 <w:bCs/>
                 <w:sz w:val="18"/>
@@ -492,6 +518,7 @@
             </w:pPr>
             <w:r>
               <w:rPr>
+                <w:rFonts w:ascii="Times New Roman" w:hAnsi="Times New Roman" w:cs="Times New Roman"/>
                 <w:b/>
                 <w:bCs/>
                 <w:sz w:val="18"/>
@@ -524,12 +551,13 @@
             </w:pPr>
             <w:r>
               <w:rPr>
+                <w:rFonts w:ascii="Times New Roman" w:hAnsi="Times New Roman" w:cs="Times New Roman"/>
                 <w:b/>
                 <w:bCs/>
                 <w:sz w:val="18"/>
                 <w:szCs w:val="18"/>
               </w:rPr>
-              <w:t>Leakage gap</w:t>
+              <w:t>Validation-strategy gap</w:t>
             </w:r>
           </w:p>
         </w:tc>
@@ -557,6 +585,7 @@
             </w:pPr>
             <w:r>
               <w:rPr>
+                <w:rFonts w:ascii="Times New Roman" w:hAnsi="Times New Roman" w:cs="Times New Roman"/>
                 <w:sz w:val="18"/>
                 <w:szCs w:val="18"/>
               </w:rPr>
@@ -586,6 +615,7 @@
             </w:pPr>
             <w:r>
               <w:rPr>
+                <w:rFonts w:ascii="Times New Roman" w:hAnsi="Times New Roman" w:cs="Times New Roman"/>
                 <w:sz w:val="18"/>
                 <w:szCs w:val="18"/>
               </w:rPr>
@@ -615,6 +645,7 @@
             </w:pPr>
             <w:r>
               <w:rPr>
+                <w:rFonts w:ascii="Times New Roman" w:hAnsi="Times New Roman" w:cs="Times New Roman"/>
                 <w:sz w:val="18"/>
                 <w:szCs w:val="18"/>
               </w:rPr>
@@ -644,6 +675,7 @@
             </w:pPr>
             <w:r>
               <w:rPr>
+                <w:rFonts w:ascii="Times New Roman" w:hAnsi="Times New Roman" w:cs="Times New Roman"/>
                 <w:sz w:val="18"/>
                 <w:szCs w:val="18"/>
               </w:rPr>
@@ -673,6 +705,7 @@
             </w:pPr>
             <w:r>
               <w:rPr>
+                <w:rFonts w:ascii="Times New Roman" w:hAnsi="Times New Roman" w:cs="Times New Roman"/>
                 <w:sz w:val="18"/>
                 <w:szCs w:val="18"/>
               </w:rPr>
@@ -704,6 +737,7 @@
             </w:pPr>
             <w:r>
               <w:rPr>
+                <w:rFonts w:ascii="Times New Roman" w:hAnsi="Times New Roman" w:cs="Times New Roman"/>
                 <w:sz w:val="18"/>
                 <w:szCs w:val="18"/>
               </w:rPr>
@@ -733,6 +767,7 @@
             </w:pPr>
             <w:r>
               <w:rPr>
+                <w:rFonts w:ascii="Times New Roman" w:hAnsi="Times New Roman" w:cs="Times New Roman"/>
                 <w:sz w:val="18"/>
                 <w:szCs w:val="18"/>
               </w:rPr>
@@ -762,6 +797,7 @@
             </w:pPr>
             <w:r>
               <w:rPr>
+                <w:rFonts w:ascii="Times New Roman" w:hAnsi="Times New Roman" w:cs="Times New Roman"/>
                 <w:sz w:val="18"/>
                 <w:szCs w:val="18"/>
               </w:rPr>
@@ -791,6 +827,7 @@
             </w:pPr>
             <w:r>
               <w:rPr>
+                <w:rFonts w:ascii="Times New Roman" w:hAnsi="Times New Roman" w:cs="Times New Roman"/>
                 <w:sz w:val="18"/>
                 <w:szCs w:val="18"/>
               </w:rPr>
@@ -820,6 +857,7 @@
             </w:pPr>
             <w:r>
               <w:rPr>
+                <w:rFonts w:ascii="Times New Roman" w:hAnsi="Times New Roman" w:cs="Times New Roman"/>
                 <w:sz w:val="18"/>
                 <w:szCs w:val="18"/>
               </w:rPr>
@@ -851,6 +889,7 @@
             </w:pPr>
             <w:r>
               <w:rPr>
+                <w:rFonts w:ascii="Times New Roman" w:hAnsi="Times New Roman" w:cs="Times New Roman"/>
                 <w:sz w:val="18"/>
                 <w:szCs w:val="18"/>
               </w:rPr>
@@ -880,6 +919,7 @@
             </w:pPr>
             <w:r>
               <w:rPr>
+                <w:rFonts w:ascii="Times New Roman" w:hAnsi="Times New Roman" w:cs="Times New Roman"/>
                 <w:sz w:val="18"/>
                 <w:szCs w:val="18"/>
               </w:rPr>
@@ -909,6 +949,7 @@
             </w:pPr>
             <w:r>
               <w:rPr>
+                <w:rFonts w:ascii="Times New Roman" w:hAnsi="Times New Roman" w:cs="Times New Roman"/>
                 <w:sz w:val="18"/>
                 <w:szCs w:val="18"/>
               </w:rPr>
@@ -938,6 +979,7 @@
             </w:pPr>
             <w:r>
               <w:rPr>
+                <w:rFonts w:ascii="Times New Roman" w:hAnsi="Times New Roman" w:cs="Times New Roman"/>
                 <w:sz w:val="18"/>
                 <w:szCs w:val="18"/>
               </w:rPr>
@@ -967,6 +1009,7 @@
             </w:pPr>
             <w:r>
               <w:rPr>
+                <w:rFonts w:ascii="Times New Roman" w:hAnsi="Times New Roman" w:cs="Times New Roman"/>
                 <w:sz w:val="18"/>
                 <w:szCs w:val="18"/>
               </w:rPr>
@@ -998,6 +1041,7 @@
             </w:pPr>
             <w:r>
               <w:rPr>
+                <w:rFonts w:ascii="Times New Roman" w:hAnsi="Times New Roman" w:cs="Times New Roman"/>
                 <w:sz w:val="18"/>
                 <w:szCs w:val="18"/>
               </w:rPr>
@@ -1027,6 +1071,7 @@
             </w:pPr>
             <w:r>
               <w:rPr>
+                <w:rFonts w:ascii="Times New Roman" w:hAnsi="Times New Roman" w:cs="Times New Roman"/>
                 <w:sz w:val="18"/>
                 <w:szCs w:val="18"/>
               </w:rPr>
@@ -1056,6 +1101,7 @@
             </w:pPr>
             <w:r>
               <w:rPr>
+                <w:rFonts w:ascii="Times New Roman" w:hAnsi="Times New Roman" w:cs="Times New Roman"/>
                 <w:sz w:val="18"/>
                 <w:szCs w:val="18"/>
               </w:rPr>
@@ -1085,6 +1131,7 @@
             </w:pPr>
             <w:r>
               <w:rPr>
+                <w:rFonts w:ascii="Times New Roman" w:hAnsi="Times New Roman" w:cs="Times New Roman"/>
                 <w:sz w:val="18"/>
                 <w:szCs w:val="18"/>
               </w:rPr>
@@ -1114,6 +1161,7 @@
             </w:pPr>
             <w:r>
               <w:rPr>
+                <w:rFonts w:ascii="Times New Roman" w:hAnsi="Times New Roman" w:cs="Times New Roman"/>
                 <w:sz w:val="18"/>
                 <w:szCs w:val="18"/>
               </w:rPr>
@@ -1145,6 +1193,7 @@
             </w:pPr>
             <w:r>
               <w:rPr>
+                <w:rFonts w:ascii="Times New Roman" w:hAnsi="Times New Roman" w:cs="Times New Roman"/>
                 <w:sz w:val="18"/>
                 <w:szCs w:val="18"/>
               </w:rPr>
@@ -1174,6 +1223,7 @@
             </w:pPr>
             <w:r>
               <w:rPr>
+                <w:rFonts w:ascii="Times New Roman" w:hAnsi="Times New Roman" w:cs="Times New Roman"/>
                 <w:sz w:val="18"/>
                 <w:szCs w:val="18"/>
               </w:rPr>
@@ -1203,6 +1253,7 @@
             </w:pPr>
             <w:r>
               <w:rPr>
+                <w:rFonts w:ascii="Times New Roman" w:hAnsi="Times New Roman" w:cs="Times New Roman"/>
                 <w:sz w:val="18"/>
                 <w:szCs w:val="18"/>
               </w:rPr>
@@ -1232,6 +1283,7 @@
             </w:pPr>
             <w:r>
               <w:rPr>
+                <w:rFonts w:ascii="Times New Roman" w:hAnsi="Times New Roman" w:cs="Times New Roman"/>
                 <w:sz w:val="18"/>
                 <w:szCs w:val="18"/>
               </w:rPr>
@@ -1261,6 +1313,7 @@
             </w:pPr>
             <w:r>
               <w:rPr>
+                <w:rFonts w:ascii="Times New Roman" w:hAnsi="Times New Roman" w:cs="Times New Roman"/>
                 <w:sz w:val="18"/>
                 <w:szCs w:val="18"/>
               </w:rPr>
@@ -1292,6 +1345,7 @@
             </w:pPr>
             <w:r>
               <w:rPr>
+                <w:rFonts w:ascii="Times New Roman" w:hAnsi="Times New Roman" w:cs="Times New Roman"/>
                 <w:sz w:val="18"/>
                 <w:szCs w:val="18"/>
               </w:rPr>
@@ -1321,6 +1375,7 @@
             </w:pPr>
             <w:r>
               <w:rPr>
+                <w:rFonts w:ascii="Times New Roman" w:hAnsi="Times New Roman" w:cs="Times New Roman"/>
                 <w:sz w:val="18"/>
                 <w:szCs w:val="18"/>
               </w:rPr>
@@ -1350,6 +1405,7 @@
             </w:pPr>
             <w:r>
               <w:rPr>
+                <w:rFonts w:ascii="Times New Roman" w:hAnsi="Times New Roman" w:cs="Times New Roman"/>
                 <w:sz w:val="18"/>
                 <w:szCs w:val="18"/>
               </w:rPr>
@@ -1379,6 +1435,7 @@
             </w:pPr>
             <w:r>
               <w:rPr>
+                <w:rFonts w:ascii="Times New Roman" w:hAnsi="Times New Roman" w:cs="Times New Roman"/>
                 <w:sz w:val="18"/>
                 <w:szCs w:val="18"/>
               </w:rPr>
@@ -1408,6 +1465,7 @@
             </w:pPr>
             <w:r>
               <w:rPr>
+                <w:rFonts w:ascii="Times New Roman" w:hAnsi="Times New Roman" w:cs="Times New Roman"/>
                 <w:sz w:val="18"/>
                 <w:szCs w:val="18"/>
               </w:rPr>
@@ -1439,6 +1497,7 @@
             </w:pPr>
             <w:r>
               <w:rPr>
+                <w:rFonts w:ascii="Times New Roman" w:hAnsi="Times New Roman" w:cs="Times New Roman"/>
                 <w:sz w:val="18"/>
                 <w:szCs w:val="18"/>
               </w:rPr>
@@ -1468,6 +1527,7 @@
             </w:pPr>
             <w:r>
               <w:rPr>
+                <w:rFonts w:ascii="Times New Roman" w:hAnsi="Times New Roman" w:cs="Times New Roman"/>
                 <w:sz w:val="18"/>
                 <w:szCs w:val="18"/>
               </w:rPr>
@@ -1497,35 +1557,37 @@
             </w:pPr>
             <w:r>
               <w:rPr>
-                <w:sz w:val="18"/>
-                <w:szCs w:val="18"/>
-              </w:rPr>
-              <w:t>0.757</w:t>
-            </w:r>
-          </w:p>
-        </w:tc>
-        <w:tc>
-          <w:tcPr>
-            <w:tcW w:w="0" w:type="auto"/>
-            <w:tcBorders>
-              <w:top w:val="single" w:sz="2" w:space="0" w:color="999999"/>
-              <w:left w:val="single" w:sz="2" w:space="0" w:color="999999"/>
-              <w:bottom w:val="single" w:sz="2" w:space="0" w:color="999999"/>
-              <w:right w:val="single" w:sz="2" w:space="0" w:color="999999"/>
-            </w:tcBorders>
-            <w:tcMar>
-              <w:top w:w="40" w:type="dxa"/>
-              <w:left w:w="80" w:type="dxa"/>
-              <w:bottom w:w="40" w:type="dxa"/>
-              <w:right w:w="80" w:type="dxa"/>
-            </w:tcMar>
-          </w:tcPr>
-          <w:p>
-            <w:pPr>
-              <w:jc w:val="center"/>
-            </w:pPr>
-            <w:r>
-              <w:rPr>
+                <w:rFonts w:ascii="Times New Roman" w:hAnsi="Times New Roman" w:cs="Times New Roman"/>
+                <w:sz w:val="18"/>
+                <w:szCs w:val="18"/>
+              </w:rPr>
+              <w:t>0.758</w:t>
+            </w:r>
+          </w:p>
+        </w:tc>
+        <w:tc>
+          <w:tcPr>
+            <w:tcW w:w="0" w:type="auto"/>
+            <w:tcBorders>
+              <w:top w:val="single" w:sz="2" w:space="0" w:color="999999"/>
+              <w:left w:val="single" w:sz="2" w:space="0" w:color="999999"/>
+              <w:bottom w:val="single" w:sz="2" w:space="0" w:color="999999"/>
+              <w:right w:val="single" w:sz="2" w:space="0" w:color="999999"/>
+            </w:tcBorders>
+            <w:tcMar>
+              <w:top w:w="40" w:type="dxa"/>
+              <w:left w:w="80" w:type="dxa"/>
+              <w:bottom w:w="40" w:type="dxa"/>
+              <w:right w:w="80" w:type="dxa"/>
+            </w:tcMar>
+          </w:tcPr>
+          <w:p>
+            <w:pPr>
+              <w:jc w:val="center"/>
+            </w:pPr>
+            <w:r>
+              <w:rPr>
+                <w:rFonts w:ascii="Times New Roman" w:hAnsi="Times New Roman" w:cs="Times New Roman"/>
                 <w:sz w:val="18"/>
                 <w:szCs w:val="18"/>
               </w:rPr>
@@ -1555,6 +1617,7 @@
             </w:pPr>
             <w:r>
               <w:rPr>
+                <w:rFonts w:ascii="Times New Roman" w:hAnsi="Times New Roman" w:cs="Times New Roman"/>
                 <w:sz w:val="18"/>
                 <w:szCs w:val="18"/>
               </w:rPr>
@@ -1586,6 +1649,7 @@
             </w:pPr>
             <w:r>
               <w:rPr>
+                <w:rFonts w:ascii="Times New Roman" w:hAnsi="Times New Roman" w:cs="Times New Roman"/>
                 <w:sz w:val="18"/>
                 <w:szCs w:val="18"/>
               </w:rPr>
@@ -1615,6 +1679,7 @@
             </w:pPr>
             <w:r>
               <w:rPr>
+                <w:rFonts w:ascii="Times New Roman" w:hAnsi="Times New Roman" w:cs="Times New Roman"/>
                 <w:sz w:val="18"/>
                 <w:szCs w:val="18"/>
               </w:rPr>
@@ -1644,6 +1709,7 @@
             </w:pPr>
             <w:r>
               <w:rPr>
+                <w:rFonts w:ascii="Times New Roman" w:hAnsi="Times New Roman" w:cs="Times New Roman"/>
                 <w:sz w:val="18"/>
                 <w:szCs w:val="18"/>
               </w:rPr>
@@ -1673,6 +1739,7 @@
             </w:pPr>
             <w:r>
               <w:rPr>
+                <w:rFonts w:ascii="Times New Roman" w:hAnsi="Times New Roman" w:cs="Times New Roman"/>
                 <w:sz w:val="18"/>
                 <w:szCs w:val="18"/>
               </w:rPr>
@@ -1702,6 +1769,7 @@
             </w:pPr>
             <w:r>
               <w:rPr>
+                <w:rFonts w:ascii="Times New Roman" w:hAnsi="Times New Roman" w:cs="Times New Roman"/>
                 <w:sz w:val="18"/>
                 <w:szCs w:val="18"/>
               </w:rPr>
@@ -1733,6 +1801,7 @@
             </w:pPr>
             <w:r>
               <w:rPr>
+                <w:rFonts w:ascii="Times New Roman" w:hAnsi="Times New Roman" w:cs="Times New Roman"/>
                 <w:sz w:val="18"/>
                 <w:szCs w:val="18"/>
               </w:rPr>
@@ -1762,6 +1831,7 @@
             </w:pPr>
             <w:r>
               <w:rPr>
+                <w:rFonts w:ascii="Times New Roman" w:hAnsi="Times New Roman" w:cs="Times New Roman"/>
                 <w:sz w:val="18"/>
                 <w:szCs w:val="18"/>
               </w:rPr>
@@ -1791,6 +1861,7 @@
             </w:pPr>
             <w:r>
               <w:rPr>
+                <w:rFonts w:ascii="Times New Roman" w:hAnsi="Times New Roman" w:cs="Times New Roman"/>
                 <w:sz w:val="18"/>
                 <w:szCs w:val="18"/>
               </w:rPr>
@@ -1820,6 +1891,7 @@
             </w:pPr>
             <w:r>
               <w:rPr>
+                <w:rFonts w:ascii="Times New Roman" w:hAnsi="Times New Roman" w:cs="Times New Roman"/>
                 <w:sz w:val="18"/>
                 <w:szCs w:val="18"/>
               </w:rPr>
@@ -1849,6 +1921,7 @@
             </w:pPr>
             <w:r>
               <w:rPr>
+                <w:rFonts w:ascii="Times New Roman" w:hAnsi="Times New Roman" w:cs="Times New Roman"/>
                 <w:sz w:val="18"/>
                 <w:szCs w:val="18"/>
               </w:rPr>
@@ -1864,18 +1937,19 @@
       </w:pPr>
       <w:r>
         <w:rPr>
+          <w:rFonts w:ascii="Times New Roman" w:hAnsi="Times New Roman" w:cs="Times New Roman"/>
           <w:i/>
           <w:iCs/>
           <w:sz w:val="18"/>
           <w:szCs w:val="18"/>
         </w:rPr>
-        <w:t>Regression of leakage gap on duplicated fraction: slope 0.261, intercept 0.755, R² = 0.817 (n = 9 points). Because the duplication levels are generated from the same deduplicated dataset and are not independent, this regression is a descriptive summary rather than an inferential test.</w:t>
+        <w:t>Regression of validation-strategy gap on duplicated fraction: slope 0.261, intercept 0.755, R² = 0.817 (n = 9 points). Because the duplication levels are generated from the same deduplicated dataset and are not independent, this regression is a descriptive summary rather than an inferential test.</w:t>
       </w:r>
     </w:p>
     <w:p/>
     <w:p>
       <w:pPr>
-        <w:spacing w:before="240" w:after="80"/>
+        <w:spacing w:before="240" w:after="80" w:line="360" w:lineRule="auto"/>
         <w:jc w:val="both"/>
         <w:rPr>
           <w:rFonts w:ascii="Times New Roman" w:hAnsi="Times New Roman" w:cs="Times New Roman"/>
@@ -1886,12 +1960,16 @@
           <w:rFonts w:ascii="Times New Roman" w:hAnsi="Times New Roman" w:cs="Times New Roman"/>
           <w:b/>
           <w:bCs/>
+          <w:sz w:val="24"/>
+          <w:szCs w:val="24"/>
         </w:rPr>
         <w:t xml:space="preserve">Table S2. </w:t>
       </w:r>
       <w:r>
         <w:rPr>
           <w:rFonts w:ascii="Times New Roman" w:hAnsi="Times New Roman" w:cs="Times New Roman"/>
+          <w:sz w:val="24"/>
+          <w:szCs w:val="24"/>
         </w:rPr>
         <w:t>Multi-seed stability. LOMO MCC for each classifier across eight random seeds, with per-model standard deviation (SD). Underlies Figure 2.</w:t>
       </w:r>
@@ -1945,6 +2023,7 @@
             </w:pPr>
             <w:r>
               <w:rPr>
+                <w:rFonts w:ascii="Times New Roman" w:hAnsi="Times New Roman" w:cs="Times New Roman"/>
                 <w:b/>
                 <w:bCs/>
                 <w:sz w:val="18"/>
@@ -1977,6 +2056,7 @@
             </w:pPr>
             <w:r>
               <w:rPr>
+                <w:rFonts w:ascii="Times New Roman" w:hAnsi="Times New Roman" w:cs="Times New Roman"/>
                 <w:b/>
                 <w:bCs/>
                 <w:sz w:val="18"/>
@@ -2009,6 +2089,7 @@
             </w:pPr>
             <w:r>
               <w:rPr>
+                <w:rFonts w:ascii="Times New Roman" w:hAnsi="Times New Roman" w:cs="Times New Roman"/>
                 <w:b/>
                 <w:bCs/>
                 <w:sz w:val="18"/>
@@ -2041,6 +2122,7 @@
             </w:pPr>
             <w:r>
               <w:rPr>
+                <w:rFonts w:ascii="Times New Roman" w:hAnsi="Times New Roman" w:cs="Times New Roman"/>
                 <w:b/>
                 <w:bCs/>
                 <w:sz w:val="18"/>
@@ -2073,6 +2155,7 @@
             </w:pPr>
             <w:r>
               <w:rPr>
+                <w:rFonts w:ascii="Times New Roman" w:hAnsi="Times New Roman" w:cs="Times New Roman"/>
                 <w:b/>
                 <w:bCs/>
                 <w:sz w:val="18"/>
@@ -2105,6 +2188,7 @@
             </w:pPr>
             <w:r>
               <w:rPr>
+                <w:rFonts w:ascii="Times New Roman" w:hAnsi="Times New Roman" w:cs="Times New Roman"/>
                 <w:b/>
                 <w:bCs/>
                 <w:sz w:val="18"/>
@@ -2138,6 +2222,7 @@
             </w:pPr>
             <w:r>
               <w:rPr>
+                <w:rFonts w:ascii="Times New Roman" w:hAnsi="Times New Roman" w:cs="Times New Roman"/>
                 <w:sz w:val="18"/>
                 <w:szCs w:val="18"/>
               </w:rPr>
@@ -2167,6 +2252,7 @@
             </w:pPr>
             <w:r>
               <w:rPr>
+                <w:rFonts w:ascii="Times New Roman" w:hAnsi="Times New Roman" w:cs="Times New Roman"/>
                 <w:sz w:val="18"/>
                 <w:szCs w:val="18"/>
               </w:rPr>
@@ -2196,6 +2282,7 @@
             </w:pPr>
             <w:r>
               <w:rPr>
+                <w:rFonts w:ascii="Times New Roman" w:hAnsi="Times New Roman" w:cs="Times New Roman"/>
                 <w:sz w:val="18"/>
                 <w:szCs w:val="18"/>
               </w:rPr>
@@ -2225,6 +2312,7 @@
             </w:pPr>
             <w:r>
               <w:rPr>
+                <w:rFonts w:ascii="Times New Roman" w:hAnsi="Times New Roman" w:cs="Times New Roman"/>
                 <w:sz w:val="18"/>
                 <w:szCs w:val="18"/>
               </w:rPr>
@@ -2254,6 +2342,7 @@
             </w:pPr>
             <w:r>
               <w:rPr>
+                <w:rFonts w:ascii="Times New Roman" w:hAnsi="Times New Roman" w:cs="Times New Roman"/>
                 <w:sz w:val="18"/>
                 <w:szCs w:val="18"/>
               </w:rPr>
@@ -2283,6 +2372,7 @@
             </w:pPr>
             <w:r>
               <w:rPr>
+                <w:rFonts w:ascii="Times New Roman" w:hAnsi="Times New Roman" w:cs="Times New Roman"/>
                 <w:sz w:val="18"/>
                 <w:szCs w:val="18"/>
               </w:rPr>
@@ -2314,6 +2404,7 @@
             </w:pPr>
             <w:r>
               <w:rPr>
+                <w:rFonts w:ascii="Times New Roman" w:hAnsi="Times New Roman" w:cs="Times New Roman"/>
                 <w:sz w:val="18"/>
                 <w:szCs w:val="18"/>
               </w:rPr>
@@ -2343,6 +2434,7 @@
             </w:pPr>
             <w:r>
               <w:rPr>
+                <w:rFonts w:ascii="Times New Roman" w:hAnsi="Times New Roman" w:cs="Times New Roman"/>
                 <w:sz w:val="18"/>
                 <w:szCs w:val="18"/>
               </w:rPr>
@@ -2372,6 +2464,7 @@
             </w:pPr>
             <w:r>
               <w:rPr>
+                <w:rFonts w:ascii="Times New Roman" w:hAnsi="Times New Roman" w:cs="Times New Roman"/>
                 <w:sz w:val="18"/>
                 <w:szCs w:val="18"/>
               </w:rPr>
@@ -2401,6 +2494,7 @@
             </w:pPr>
             <w:r>
               <w:rPr>
+                <w:rFonts w:ascii="Times New Roman" w:hAnsi="Times New Roman" w:cs="Times New Roman"/>
                 <w:sz w:val="18"/>
                 <w:szCs w:val="18"/>
               </w:rPr>
@@ -2430,6 +2524,7 @@
             </w:pPr>
             <w:r>
               <w:rPr>
+                <w:rFonts w:ascii="Times New Roman" w:hAnsi="Times New Roman" w:cs="Times New Roman"/>
                 <w:sz w:val="18"/>
                 <w:szCs w:val="18"/>
               </w:rPr>
@@ -2459,6 +2554,7 @@
             </w:pPr>
             <w:r>
               <w:rPr>
+                <w:rFonts w:ascii="Times New Roman" w:hAnsi="Times New Roman" w:cs="Times New Roman"/>
                 <w:sz w:val="18"/>
                 <w:szCs w:val="18"/>
               </w:rPr>
@@ -2490,6 +2586,7 @@
             </w:pPr>
             <w:r>
               <w:rPr>
+                <w:rFonts w:ascii="Times New Roman" w:hAnsi="Times New Roman" w:cs="Times New Roman"/>
                 <w:sz w:val="18"/>
                 <w:szCs w:val="18"/>
               </w:rPr>
@@ -2519,6 +2616,7 @@
             </w:pPr>
             <w:r>
               <w:rPr>
+                <w:rFonts w:ascii="Times New Roman" w:hAnsi="Times New Roman" w:cs="Times New Roman"/>
                 <w:sz w:val="18"/>
                 <w:szCs w:val="18"/>
               </w:rPr>
@@ -2548,6 +2646,7 @@
             </w:pPr>
             <w:r>
               <w:rPr>
+                <w:rFonts w:ascii="Times New Roman" w:hAnsi="Times New Roman" w:cs="Times New Roman"/>
                 <w:sz w:val="18"/>
                 <w:szCs w:val="18"/>
               </w:rPr>
@@ -2577,6 +2676,7 @@
             </w:pPr>
             <w:r>
               <w:rPr>
+                <w:rFonts w:ascii="Times New Roman" w:hAnsi="Times New Roman" w:cs="Times New Roman"/>
                 <w:sz w:val="18"/>
                 <w:szCs w:val="18"/>
               </w:rPr>
@@ -2606,6 +2706,7 @@
             </w:pPr>
             <w:r>
               <w:rPr>
+                <w:rFonts w:ascii="Times New Roman" w:hAnsi="Times New Roman" w:cs="Times New Roman"/>
                 <w:sz w:val="18"/>
                 <w:szCs w:val="18"/>
               </w:rPr>
@@ -2635,6 +2736,7 @@
             </w:pPr>
             <w:r>
               <w:rPr>
+                <w:rFonts w:ascii="Times New Roman" w:hAnsi="Times New Roman" w:cs="Times New Roman"/>
                 <w:sz w:val="18"/>
                 <w:szCs w:val="18"/>
               </w:rPr>
@@ -2666,6 +2768,7 @@
             </w:pPr>
             <w:r>
               <w:rPr>
+                <w:rFonts w:ascii="Times New Roman" w:hAnsi="Times New Roman" w:cs="Times New Roman"/>
                 <w:sz w:val="18"/>
                 <w:szCs w:val="18"/>
               </w:rPr>
@@ -2695,6 +2798,7 @@
             </w:pPr>
             <w:r>
               <w:rPr>
+                <w:rFonts w:ascii="Times New Roman" w:hAnsi="Times New Roman" w:cs="Times New Roman"/>
                 <w:sz w:val="18"/>
                 <w:szCs w:val="18"/>
               </w:rPr>
@@ -2724,6 +2828,7 @@
             </w:pPr>
             <w:r>
               <w:rPr>
+                <w:rFonts w:ascii="Times New Roman" w:hAnsi="Times New Roman" w:cs="Times New Roman"/>
                 <w:sz w:val="18"/>
                 <w:szCs w:val="18"/>
               </w:rPr>
@@ -2753,6 +2858,7 @@
             </w:pPr>
             <w:r>
               <w:rPr>
+                <w:rFonts w:ascii="Times New Roman" w:hAnsi="Times New Roman" w:cs="Times New Roman"/>
                 <w:sz w:val="18"/>
                 <w:szCs w:val="18"/>
               </w:rPr>
@@ -2782,6 +2888,7 @@
             </w:pPr>
             <w:r>
               <w:rPr>
+                <w:rFonts w:ascii="Times New Roman" w:hAnsi="Times New Roman" w:cs="Times New Roman"/>
                 <w:sz w:val="18"/>
                 <w:szCs w:val="18"/>
               </w:rPr>
@@ -2811,6 +2918,7 @@
             </w:pPr>
             <w:r>
               <w:rPr>
+                <w:rFonts w:ascii="Times New Roman" w:hAnsi="Times New Roman" w:cs="Times New Roman"/>
                 <w:sz w:val="18"/>
                 <w:szCs w:val="18"/>
               </w:rPr>
@@ -2842,6 +2950,7 @@
             </w:pPr>
             <w:r>
               <w:rPr>
+                <w:rFonts w:ascii="Times New Roman" w:hAnsi="Times New Roman" w:cs="Times New Roman"/>
                 <w:sz w:val="18"/>
                 <w:szCs w:val="18"/>
               </w:rPr>
@@ -2871,6 +2980,7 @@
             </w:pPr>
             <w:r>
               <w:rPr>
+                <w:rFonts w:ascii="Times New Roman" w:hAnsi="Times New Roman" w:cs="Times New Roman"/>
                 <w:sz w:val="18"/>
                 <w:szCs w:val="18"/>
               </w:rPr>
@@ -2900,6 +3010,7 @@
             </w:pPr>
             <w:r>
               <w:rPr>
+                <w:rFonts w:ascii="Times New Roman" w:hAnsi="Times New Roman" w:cs="Times New Roman"/>
                 <w:sz w:val="18"/>
                 <w:szCs w:val="18"/>
               </w:rPr>
@@ -2929,6 +3040,7 @@
             </w:pPr>
             <w:r>
               <w:rPr>
+                <w:rFonts w:ascii="Times New Roman" w:hAnsi="Times New Roman" w:cs="Times New Roman"/>
                 <w:sz w:val="18"/>
                 <w:szCs w:val="18"/>
               </w:rPr>
@@ -2958,6 +3070,7 @@
             </w:pPr>
             <w:r>
               <w:rPr>
+                <w:rFonts w:ascii="Times New Roman" w:hAnsi="Times New Roman" w:cs="Times New Roman"/>
                 <w:sz w:val="18"/>
                 <w:szCs w:val="18"/>
               </w:rPr>
@@ -2987,6 +3100,7 @@
             </w:pPr>
             <w:r>
               <w:rPr>
+                <w:rFonts w:ascii="Times New Roman" w:hAnsi="Times New Roman" w:cs="Times New Roman"/>
                 <w:sz w:val="18"/>
                 <w:szCs w:val="18"/>
               </w:rPr>
@@ -3018,6 +3132,7 @@
             </w:pPr>
             <w:r>
               <w:rPr>
+                <w:rFonts w:ascii="Times New Roman" w:hAnsi="Times New Roman" w:cs="Times New Roman"/>
                 <w:sz w:val="18"/>
                 <w:szCs w:val="18"/>
               </w:rPr>
@@ -3047,6 +3162,7 @@
             </w:pPr>
             <w:r>
               <w:rPr>
+                <w:rFonts w:ascii="Times New Roman" w:hAnsi="Times New Roman" w:cs="Times New Roman"/>
                 <w:sz w:val="18"/>
                 <w:szCs w:val="18"/>
               </w:rPr>
@@ -3076,6 +3192,7 @@
             </w:pPr>
             <w:r>
               <w:rPr>
+                <w:rFonts w:ascii="Times New Roman" w:hAnsi="Times New Roman" w:cs="Times New Roman"/>
                 <w:sz w:val="18"/>
                 <w:szCs w:val="18"/>
               </w:rPr>
@@ -3105,6 +3222,7 @@
             </w:pPr>
             <w:r>
               <w:rPr>
+                <w:rFonts w:ascii="Times New Roman" w:hAnsi="Times New Roman" w:cs="Times New Roman"/>
                 <w:sz w:val="18"/>
                 <w:szCs w:val="18"/>
               </w:rPr>
@@ -3134,6 +3252,7 @@
             </w:pPr>
             <w:r>
               <w:rPr>
+                <w:rFonts w:ascii="Times New Roman" w:hAnsi="Times New Roman" w:cs="Times New Roman"/>
                 <w:sz w:val="18"/>
                 <w:szCs w:val="18"/>
               </w:rPr>
@@ -3163,6 +3282,7 @@
             </w:pPr>
             <w:r>
               <w:rPr>
+                <w:rFonts w:ascii="Times New Roman" w:hAnsi="Times New Roman" w:cs="Times New Roman"/>
                 <w:sz w:val="18"/>
                 <w:szCs w:val="18"/>
               </w:rPr>
@@ -3194,6 +3314,7 @@
             </w:pPr>
             <w:r>
               <w:rPr>
+                <w:rFonts w:ascii="Times New Roman" w:hAnsi="Times New Roman" w:cs="Times New Roman"/>
                 <w:sz w:val="18"/>
                 <w:szCs w:val="18"/>
               </w:rPr>
@@ -3223,6 +3344,7 @@
             </w:pPr>
             <w:r>
               <w:rPr>
+                <w:rFonts w:ascii="Times New Roman" w:hAnsi="Times New Roman" w:cs="Times New Roman"/>
                 <w:sz w:val="18"/>
                 <w:szCs w:val="18"/>
               </w:rPr>
@@ -3252,6 +3374,7 @@
             </w:pPr>
             <w:r>
               <w:rPr>
+                <w:rFonts w:ascii="Times New Roman" w:hAnsi="Times New Roman" w:cs="Times New Roman"/>
                 <w:sz w:val="18"/>
                 <w:szCs w:val="18"/>
               </w:rPr>
@@ -3281,6 +3404,7 @@
             </w:pPr>
             <w:r>
               <w:rPr>
+                <w:rFonts w:ascii="Times New Roman" w:hAnsi="Times New Roman" w:cs="Times New Roman"/>
                 <w:sz w:val="18"/>
                 <w:szCs w:val="18"/>
               </w:rPr>
@@ -3310,6 +3434,7 @@
             </w:pPr>
             <w:r>
               <w:rPr>
+                <w:rFonts w:ascii="Times New Roman" w:hAnsi="Times New Roman" w:cs="Times New Roman"/>
                 <w:sz w:val="18"/>
                 <w:szCs w:val="18"/>
               </w:rPr>
@@ -3339,6 +3464,7 @@
             </w:pPr>
             <w:r>
               <w:rPr>
+                <w:rFonts w:ascii="Times New Roman" w:hAnsi="Times New Roman" w:cs="Times New Roman"/>
                 <w:sz w:val="18"/>
                 <w:szCs w:val="18"/>
               </w:rPr>
@@ -3370,6 +3496,7 @@
             </w:pPr>
             <w:r>
               <w:rPr>
+                <w:rFonts w:ascii="Times New Roman" w:hAnsi="Times New Roman" w:cs="Times New Roman"/>
                 <w:sz w:val="18"/>
                 <w:szCs w:val="18"/>
               </w:rPr>
@@ -3399,6 +3526,7 @@
             </w:pPr>
             <w:r>
               <w:rPr>
+                <w:rFonts w:ascii="Times New Roman" w:hAnsi="Times New Roman" w:cs="Times New Roman"/>
                 <w:sz w:val="18"/>
                 <w:szCs w:val="18"/>
               </w:rPr>
@@ -3428,6 +3556,7 @@
             </w:pPr>
             <w:r>
               <w:rPr>
+                <w:rFonts w:ascii="Times New Roman" w:hAnsi="Times New Roman" w:cs="Times New Roman"/>
                 <w:sz w:val="18"/>
                 <w:szCs w:val="18"/>
               </w:rPr>
@@ -3457,6 +3586,7 @@
             </w:pPr>
             <w:r>
               <w:rPr>
+                <w:rFonts w:ascii="Times New Roman" w:hAnsi="Times New Roman" w:cs="Times New Roman"/>
                 <w:sz w:val="18"/>
                 <w:szCs w:val="18"/>
               </w:rPr>
@@ -3486,6 +3616,7 @@
             </w:pPr>
             <w:r>
               <w:rPr>
+                <w:rFonts w:ascii="Times New Roman" w:hAnsi="Times New Roman" w:cs="Times New Roman"/>
                 <w:sz w:val="18"/>
                 <w:szCs w:val="18"/>
               </w:rPr>
@@ -3515,6 +3646,7 @@
             </w:pPr>
             <w:r>
               <w:rPr>
+                <w:rFonts w:ascii="Times New Roman" w:hAnsi="Times New Roman" w:cs="Times New Roman"/>
                 <w:sz w:val="18"/>
                 <w:szCs w:val="18"/>
               </w:rPr>
@@ -3546,6 +3678,7 @@
             </w:pPr>
             <w:r>
               <w:rPr>
+                <w:rFonts w:ascii="Times New Roman" w:hAnsi="Times New Roman" w:cs="Times New Roman"/>
                 <w:sz w:val="18"/>
                 <w:szCs w:val="18"/>
               </w:rPr>
@@ -3575,6 +3708,7 @@
             </w:pPr>
             <w:r>
               <w:rPr>
+                <w:rFonts w:ascii="Times New Roman" w:hAnsi="Times New Roman" w:cs="Times New Roman"/>
                 <w:sz w:val="18"/>
                 <w:szCs w:val="18"/>
               </w:rPr>
@@ -3604,6 +3738,7 @@
             </w:pPr>
             <w:r>
               <w:rPr>
+                <w:rFonts w:ascii="Times New Roman" w:hAnsi="Times New Roman" w:cs="Times New Roman"/>
                 <w:sz w:val="18"/>
                 <w:szCs w:val="18"/>
               </w:rPr>
@@ -3633,6 +3768,7 @@
             </w:pPr>
             <w:r>
               <w:rPr>
+                <w:rFonts w:ascii="Times New Roman" w:hAnsi="Times New Roman" w:cs="Times New Roman"/>
                 <w:sz w:val="18"/>
                 <w:szCs w:val="18"/>
               </w:rPr>
@@ -3662,6 +3798,7 @@
             </w:pPr>
             <w:r>
               <w:rPr>
+                <w:rFonts w:ascii="Times New Roman" w:hAnsi="Times New Roman" w:cs="Times New Roman"/>
                 <w:sz w:val="18"/>
                 <w:szCs w:val="18"/>
               </w:rPr>
@@ -3691,6 +3828,7 @@
             </w:pPr>
             <w:r>
               <w:rPr>
+                <w:rFonts w:ascii="Times New Roman" w:hAnsi="Times New Roman" w:cs="Times New Roman"/>
                 <w:sz w:val="18"/>
                 <w:szCs w:val="18"/>
               </w:rPr>
@@ -3712,6 +3850,7 @@
       </w:pPr>
       <w:r>
         <w:rPr>
+          <w:rFonts w:ascii="Times New Roman" w:hAnsi="Times New Roman" w:cs="Times New Roman"/>
           <w:i/>
           <w:iCs/>
           <w:sz w:val="18"/>
@@ -3803,9 +3942,10 @@
       </w:pPr>
     </w:p>
     <w:p/>
+    <w:p/>
     <w:p>
       <w:pPr>
-        <w:spacing w:before="240" w:after="80"/>
+        <w:spacing w:before="240" w:after="80" w:line="360" w:lineRule="auto"/>
         <w:jc w:val="both"/>
         <w:rPr>
           <w:rFonts w:ascii="Times New Roman" w:hAnsi="Times New Roman" w:cs="Times New Roman"/>
@@ -3816,913 +3956,16 @@
           <w:rFonts w:ascii="Times New Roman" w:hAnsi="Times New Roman" w:cs="Times New Roman"/>
           <w:b/>
           <w:bCs/>
+          <w:sz w:val="24"/>
+          <w:szCs w:val="24"/>
         </w:rPr>
-        <w:lastRenderedPageBreak/>
         <w:t xml:space="preserve">Table S3. </w:t>
       </w:r>
       <w:r>
         <w:rPr>
           <w:rFonts w:ascii="Times New Roman" w:hAnsi="Times New Roman" w:cs="Times New Roman"/>
-        </w:rPr>
-        <w:t xml:space="preserve">Per-oxide leave-one-oxide-out folds (full XGBoost model). Each oxide is held out in turn; n and number cytotoxic are for the held-out oxide.</w:t>
-      </w:r>
-    </w:p>
-    <w:tbl>
-      <w:tblPr>
-        <w:tblW w:w="5000" w:type="pct"/>
-        <w:tblBorders>
-          <w:top w:val="single" w:sz="4" w:space="0" w:color="auto"/>
-          <w:left w:val="single" w:sz="4" w:space="0" w:color="auto"/>
-          <w:bottom w:val="single" w:sz="4" w:space="0" w:color="auto"/>
-          <w:right w:val="single" w:sz="4" w:space="0" w:color="auto"/>
-          <w:insideH w:val="single" w:sz="4" w:space="0" w:color="auto"/>
-          <w:insideV w:val="single" w:sz="4" w:space="0" w:color="auto"/>
-        </w:tblBorders>
-        <w:tblCellMar>
-          <w:left w:w="10" w:type="dxa"/>
-          <w:right w:w="10" w:type="dxa"/>
-        </w:tblCellMar>
-        <w:tblLook w:val="0000" w:firstRow="0" w:lastRow="0" w:firstColumn="0" w:lastColumn="0" w:noHBand="0" w:noVBand="0"/>
-      </w:tblPr>
-      <w:tblGrid>
-        <w:gridCol w:w="2848"/>
-        <w:gridCol w:w="975"/>
-        <w:gridCol w:w="2495"/>
-        <w:gridCol w:w="3036"/>
-      </w:tblGrid>
-      <w:tr>
-        <w:tc>
-          <w:tcPr>
-            <w:tcW w:w="0" w:type="auto"/>
-            <w:tcBorders>
-              <w:top w:val="single" w:sz="2" w:space="0" w:color="999999"/>
-              <w:left w:val="single" w:sz="2" w:space="0" w:color="999999"/>
-              <w:bottom w:val="single" w:sz="2" w:space="0" w:color="999999"/>
-              <w:right w:val="single" w:sz="2" w:space="0" w:color="999999"/>
-            </w:tcBorders>
-            <w:shd w:val="clear" w:color="auto" w:fill="F2F2F2"/>
-            <w:tcMar>
-              <w:top w:w="40" w:type="dxa"/>
-              <w:left w:w="80" w:type="dxa"/>
-              <w:bottom w:w="40" w:type="dxa"/>
-              <w:right w:w="80" w:type="dxa"/>
-            </w:tcMar>
-          </w:tcPr>
-          <w:p>
-            <w:pPr>
-              <w:jc w:val="center"/>
-            </w:pPr>
-            <w:r>
-              <w:rPr>
-                <w:b/>
-                <w:bCs/>
-                <w:sz w:val="18"/>
-                <w:szCs w:val="18"/>
-              </w:rPr>
-              <w:t>Held-out oxide</w:t>
-            </w:r>
-          </w:p>
-        </w:tc>
-        <w:tc>
-          <w:tcPr>
-            <w:tcW w:w="0" w:type="auto"/>
-            <w:tcBorders>
-              <w:top w:val="single" w:sz="2" w:space="0" w:color="999999"/>
-              <w:left w:val="single" w:sz="2" w:space="0" w:color="999999"/>
-              <w:bottom w:val="single" w:sz="2" w:space="0" w:color="999999"/>
-              <w:right w:val="single" w:sz="2" w:space="0" w:color="999999"/>
-            </w:tcBorders>
-            <w:shd w:val="clear" w:color="auto" w:fill="F2F2F2"/>
-            <w:tcMar>
-              <w:top w:w="40" w:type="dxa"/>
-              <w:left w:w="80" w:type="dxa"/>
-              <w:bottom w:w="40" w:type="dxa"/>
-              <w:right w:w="80" w:type="dxa"/>
-            </w:tcMar>
-          </w:tcPr>
-          <w:p>
-            <w:pPr>
-              <w:jc w:val="center"/>
-            </w:pPr>
-            <w:r>
-              <w:rPr>
-                <w:b/>
-                <w:bCs/>
-                <w:sz w:val="18"/>
-                <w:szCs w:val="18"/>
-              </w:rPr>
-              <w:t>n</w:t>
-            </w:r>
-          </w:p>
-        </w:tc>
-        <w:tc>
-          <w:tcPr>
-            <w:tcW w:w="0" w:type="auto"/>
-            <w:tcBorders>
-              <w:top w:val="single" w:sz="2" w:space="0" w:color="999999"/>
-              <w:left w:val="single" w:sz="2" w:space="0" w:color="999999"/>
-              <w:bottom w:val="single" w:sz="2" w:space="0" w:color="999999"/>
-              <w:right w:val="single" w:sz="2" w:space="0" w:color="999999"/>
-            </w:tcBorders>
-            <w:shd w:val="clear" w:color="auto" w:fill="F2F2F2"/>
-            <w:tcMar>
-              <w:top w:w="40" w:type="dxa"/>
-              <w:left w:w="80" w:type="dxa"/>
-              <w:bottom w:w="40" w:type="dxa"/>
-              <w:right w:w="80" w:type="dxa"/>
-            </w:tcMar>
-          </w:tcPr>
-          <w:p>
-            <w:pPr>
-              <w:jc w:val="center"/>
-            </w:pPr>
-            <w:r>
-              <w:rPr>
-                <w:b/>
-                <w:bCs/>
-                <w:sz w:val="18"/>
-                <w:szCs w:val="18"/>
-              </w:rPr>
-              <w:t>Cytotoxic (n)</w:t>
-            </w:r>
-          </w:p>
-        </w:tc>
-        <w:tc>
-          <w:tcPr>
-            <w:tcW w:w="0" w:type="auto"/>
-            <w:tcBorders>
-              <w:top w:val="single" w:sz="2" w:space="0" w:color="999999"/>
-              <w:left w:val="single" w:sz="2" w:space="0" w:color="999999"/>
-              <w:bottom w:val="single" w:sz="2" w:space="0" w:color="999999"/>
-              <w:right w:val="single" w:sz="2" w:space="0" w:color="999999"/>
-            </w:tcBorders>
-            <w:shd w:val="clear" w:color="auto" w:fill="F2F2F2"/>
-            <w:tcMar>
-              <w:top w:w="40" w:type="dxa"/>
-              <w:left w:w="80" w:type="dxa"/>
-              <w:bottom w:w="40" w:type="dxa"/>
-              <w:right w:w="80" w:type="dxa"/>
-            </w:tcMar>
-          </w:tcPr>
-          <w:p>
-            <w:pPr>
-              <w:jc w:val="center"/>
-            </w:pPr>
-            <w:r>
-              <w:rPr>
-                <w:b/>
-                <w:bCs/>
-                <w:sz w:val="18"/>
-                <w:szCs w:val="18"/>
-              </w:rPr>
-              <w:t>Fold MCC</w:t>
-            </w:r>
-          </w:p>
-        </w:tc>
-      </w:tr>
-      <w:tr>
-        <w:tc>
-          <w:tcPr>
-            <w:tcW w:w="0" w:type="auto"/>
-            <w:tcBorders>
-              <w:top w:val="single" w:sz="2" w:space="0" w:color="999999"/>
-              <w:left w:val="single" w:sz="2" w:space="0" w:color="999999"/>
-              <w:bottom w:val="single" w:sz="2" w:space="0" w:color="999999"/>
-              <w:right w:val="single" w:sz="2" w:space="0" w:color="999999"/>
-            </w:tcBorders>
-            <w:tcMar>
-              <w:top w:w="40" w:type="dxa"/>
-              <w:left w:w="80" w:type="dxa"/>
-              <w:bottom w:w="40" w:type="dxa"/>
-              <w:right w:w="80" w:type="dxa"/>
-            </w:tcMar>
-          </w:tcPr>
-          <w:p>
-            <w:pPr>
-              <w:jc w:val="center"/>
-            </w:pPr>
-            <w:r>
-              <w:rPr>
-                <w:sz w:val="18"/>
-                <w:szCs w:val="18"/>
-              </w:rPr>
-              <w:t>ZnO</w:t>
-            </w:r>
-          </w:p>
-        </w:tc>
-        <w:tc>
-          <w:tcPr>
-            <w:tcW w:w="0" w:type="auto"/>
-            <w:tcBorders>
-              <w:top w:val="single" w:sz="2" w:space="0" w:color="999999"/>
-              <w:left w:val="single" w:sz="2" w:space="0" w:color="999999"/>
-              <w:bottom w:val="single" w:sz="2" w:space="0" w:color="999999"/>
-              <w:right w:val="single" w:sz="2" w:space="0" w:color="999999"/>
-            </w:tcBorders>
-            <w:tcMar>
-              <w:top w:w="40" w:type="dxa"/>
-              <w:left w:w="80" w:type="dxa"/>
-              <w:bottom w:w="40" w:type="dxa"/>
-              <w:right w:w="80" w:type="dxa"/>
-            </w:tcMar>
-          </w:tcPr>
-          <w:p>
-            <w:pPr>
-              <w:jc w:val="center"/>
-            </w:pPr>
-            <w:r>
-              <w:rPr>
-                <w:sz w:val="18"/>
-                <w:szCs w:val="18"/>
-              </w:rPr>
-              <w:t>190</w:t>
-            </w:r>
-          </w:p>
-        </w:tc>
-        <w:tc>
-          <w:tcPr>
-            <w:tcW w:w="0" w:type="auto"/>
-            <w:tcBorders>
-              <w:top w:val="single" w:sz="2" w:space="0" w:color="999999"/>
-              <w:left w:val="single" w:sz="2" w:space="0" w:color="999999"/>
-              <w:bottom w:val="single" w:sz="2" w:space="0" w:color="999999"/>
-              <w:right w:val="single" w:sz="2" w:space="0" w:color="999999"/>
-            </w:tcBorders>
-            <w:tcMar>
-              <w:top w:w="40" w:type="dxa"/>
-              <w:left w:w="80" w:type="dxa"/>
-              <w:bottom w:w="40" w:type="dxa"/>
-              <w:right w:w="80" w:type="dxa"/>
-            </w:tcMar>
-          </w:tcPr>
-          <w:p>
-            <w:pPr>
-              <w:jc w:val="center"/>
-            </w:pPr>
-            <w:r>
-              <w:rPr>
-                <w:sz w:val="18"/>
-                <w:szCs w:val="18"/>
-              </w:rPr>
-              <w:t>60</w:t>
-            </w:r>
-          </w:p>
-        </w:tc>
-        <w:tc>
-          <w:tcPr>
-            <w:tcW w:w="0" w:type="auto"/>
-            <w:tcBorders>
-              <w:top w:val="single" w:sz="2" w:space="0" w:color="999999"/>
-              <w:left w:val="single" w:sz="2" w:space="0" w:color="999999"/>
-              <w:bottom w:val="single" w:sz="2" w:space="0" w:color="999999"/>
-              <w:right w:val="single" w:sz="2" w:space="0" w:color="999999"/>
-            </w:tcBorders>
-            <w:tcMar>
-              <w:top w:w="40" w:type="dxa"/>
-              <w:left w:w="80" w:type="dxa"/>
-              <w:bottom w:w="40" w:type="dxa"/>
-              <w:right w:w="80" w:type="dxa"/>
-            </w:tcMar>
-          </w:tcPr>
-          <w:p>
-            <w:pPr>
-              <w:jc w:val="center"/>
-            </w:pPr>
-            <w:r>
-              <w:rPr>
-                <w:sz w:val="18"/>
-                <w:szCs w:val="18"/>
-              </w:rPr>
-              <w:t>0.000</w:t>
-            </w:r>
-          </w:p>
-        </w:tc>
-      </w:tr>
-      <w:tr>
-        <w:tc>
-          <w:tcPr>
-            <w:tcW w:w="0" w:type="auto"/>
-            <w:tcBorders>
-              <w:top w:val="single" w:sz="2" w:space="0" w:color="999999"/>
-              <w:left w:val="single" w:sz="2" w:space="0" w:color="999999"/>
-              <w:bottom w:val="single" w:sz="2" w:space="0" w:color="999999"/>
-              <w:right w:val="single" w:sz="2" w:space="0" w:color="999999"/>
-            </w:tcBorders>
-            <w:tcMar>
-              <w:top w:w="40" w:type="dxa"/>
-              <w:left w:w="80" w:type="dxa"/>
-              <w:bottom w:w="40" w:type="dxa"/>
-              <w:right w:w="80" w:type="dxa"/>
-            </w:tcMar>
-          </w:tcPr>
-          <w:p>
-            <w:pPr>
-              <w:jc w:val="center"/>
-            </w:pPr>
-            <w:r>
-              <w:rPr>
-                <w:sz w:val="18"/>
-                <w:szCs w:val="18"/>
-              </w:rPr>
-              <w:t>TiO₂</w:t>
-            </w:r>
-          </w:p>
-        </w:tc>
-        <w:tc>
-          <w:tcPr>
-            <w:tcW w:w="0" w:type="auto"/>
-            <w:tcBorders>
-              <w:top w:val="single" w:sz="2" w:space="0" w:color="999999"/>
-              <w:left w:val="single" w:sz="2" w:space="0" w:color="999999"/>
-              <w:bottom w:val="single" w:sz="2" w:space="0" w:color="999999"/>
-              <w:right w:val="single" w:sz="2" w:space="0" w:color="999999"/>
-            </w:tcBorders>
-            <w:tcMar>
-              <w:top w:w="40" w:type="dxa"/>
-              <w:left w:w="80" w:type="dxa"/>
-              <w:bottom w:w="40" w:type="dxa"/>
-              <w:right w:w="80" w:type="dxa"/>
-            </w:tcMar>
-          </w:tcPr>
-          <w:p>
-            <w:pPr>
-              <w:jc w:val="center"/>
-            </w:pPr>
-            <w:r>
-              <w:rPr>
-                <w:sz w:val="18"/>
-                <w:szCs w:val="18"/>
-              </w:rPr>
-              <w:t>120</w:t>
-            </w:r>
-          </w:p>
-        </w:tc>
-        <w:tc>
-          <w:tcPr>
-            <w:tcW w:w="0" w:type="auto"/>
-            <w:tcBorders>
-              <w:top w:val="single" w:sz="2" w:space="0" w:color="999999"/>
-              <w:left w:val="single" w:sz="2" w:space="0" w:color="999999"/>
-              <w:bottom w:val="single" w:sz="2" w:space="0" w:color="999999"/>
-              <w:right w:val="single" w:sz="2" w:space="0" w:color="999999"/>
-            </w:tcBorders>
-            <w:tcMar>
-              <w:top w:w="40" w:type="dxa"/>
-              <w:left w:w="80" w:type="dxa"/>
-              <w:bottom w:w="40" w:type="dxa"/>
-              <w:right w:w="80" w:type="dxa"/>
-            </w:tcMar>
-          </w:tcPr>
-          <w:p>
-            <w:pPr>
-              <w:jc w:val="center"/>
-            </w:pPr>
-            <w:r>
-              <w:rPr>
-                <w:sz w:val="18"/>
-                <w:szCs w:val="18"/>
-              </w:rPr>
-              <w:t>1</w:t>
-            </w:r>
-          </w:p>
-        </w:tc>
-        <w:tc>
-          <w:tcPr>
-            <w:tcW w:w="0" w:type="auto"/>
-            <w:tcBorders>
-              <w:top w:val="single" w:sz="2" w:space="0" w:color="999999"/>
-              <w:left w:val="single" w:sz="2" w:space="0" w:color="999999"/>
-              <w:bottom w:val="single" w:sz="2" w:space="0" w:color="999999"/>
-              <w:right w:val="single" w:sz="2" w:space="0" w:color="999999"/>
-            </w:tcBorders>
-            <w:tcMar>
-              <w:top w:w="40" w:type="dxa"/>
-              <w:left w:w="80" w:type="dxa"/>
-              <w:bottom w:w="40" w:type="dxa"/>
-              <w:right w:w="80" w:type="dxa"/>
-            </w:tcMar>
-          </w:tcPr>
-          <w:p>
-            <w:pPr>
-              <w:jc w:val="center"/>
-            </w:pPr>
-            <w:r>
-              <w:rPr>
-                <w:sz w:val="18"/>
-                <w:szCs w:val="18"/>
-              </w:rPr>
-              <w:t>0.103</w:t>
-            </w:r>
-          </w:p>
-        </w:tc>
-      </w:tr>
-      <w:tr>
-        <w:tc>
-          <w:tcPr>
-            <w:tcW w:w="0" w:type="auto"/>
-            <w:tcBorders>
-              <w:top w:val="single" w:sz="2" w:space="0" w:color="999999"/>
-              <w:left w:val="single" w:sz="2" w:space="0" w:color="999999"/>
-              <w:bottom w:val="single" w:sz="2" w:space="0" w:color="999999"/>
-              <w:right w:val="single" w:sz="2" w:space="0" w:color="999999"/>
-            </w:tcBorders>
-            <w:tcMar>
-              <w:top w:w="40" w:type="dxa"/>
-              <w:left w:w="80" w:type="dxa"/>
-              <w:bottom w:w="40" w:type="dxa"/>
-              <w:right w:w="80" w:type="dxa"/>
-            </w:tcMar>
-          </w:tcPr>
-          <w:p>
-            <w:pPr>
-              <w:jc w:val="center"/>
-            </w:pPr>
-            <w:r>
-              <w:rPr>
-                <w:sz w:val="18"/>
-                <w:szCs w:val="18"/>
-              </w:rPr>
-              <w:t>CuO</w:t>
-            </w:r>
-          </w:p>
-        </w:tc>
-        <w:tc>
-          <w:tcPr>
-            <w:tcW w:w="0" w:type="auto"/>
-            <w:tcBorders>
-              <w:top w:val="single" w:sz="2" w:space="0" w:color="999999"/>
-              <w:left w:val="single" w:sz="2" w:space="0" w:color="999999"/>
-              <w:bottom w:val="single" w:sz="2" w:space="0" w:color="999999"/>
-              <w:right w:val="single" w:sz="2" w:space="0" w:color="999999"/>
-            </w:tcBorders>
-            <w:tcMar>
-              <w:top w:w="40" w:type="dxa"/>
-              <w:left w:w="80" w:type="dxa"/>
-              <w:bottom w:w="40" w:type="dxa"/>
-              <w:right w:w="80" w:type="dxa"/>
-            </w:tcMar>
-          </w:tcPr>
-          <w:p>
-            <w:pPr>
-              <w:jc w:val="center"/>
-            </w:pPr>
-            <w:r>
-              <w:rPr>
-                <w:sz w:val="18"/>
-                <w:szCs w:val="18"/>
-              </w:rPr>
-              <w:t>18</w:t>
-            </w:r>
-          </w:p>
-        </w:tc>
-        <w:tc>
-          <w:tcPr>
-            <w:tcW w:w="0" w:type="auto"/>
-            <w:tcBorders>
-              <w:top w:val="single" w:sz="2" w:space="0" w:color="999999"/>
-              <w:left w:val="single" w:sz="2" w:space="0" w:color="999999"/>
-              <w:bottom w:val="single" w:sz="2" w:space="0" w:color="999999"/>
-              <w:right w:val="single" w:sz="2" w:space="0" w:color="999999"/>
-            </w:tcBorders>
-            <w:tcMar>
-              <w:top w:w="40" w:type="dxa"/>
-              <w:left w:w="80" w:type="dxa"/>
-              <w:bottom w:w="40" w:type="dxa"/>
-              <w:right w:w="80" w:type="dxa"/>
-            </w:tcMar>
-          </w:tcPr>
-          <w:p>
-            <w:pPr>
-              <w:jc w:val="center"/>
-            </w:pPr>
-            <w:r>
-              <w:rPr>
-                <w:sz w:val="18"/>
-                <w:szCs w:val="18"/>
-              </w:rPr>
-              <w:t>7</w:t>
-            </w:r>
-          </w:p>
-        </w:tc>
-        <w:tc>
-          <w:tcPr>
-            <w:tcW w:w="0" w:type="auto"/>
-            <w:tcBorders>
-              <w:top w:val="single" w:sz="2" w:space="0" w:color="999999"/>
-              <w:left w:val="single" w:sz="2" w:space="0" w:color="999999"/>
-              <w:bottom w:val="single" w:sz="2" w:space="0" w:color="999999"/>
-              <w:right w:val="single" w:sz="2" w:space="0" w:color="999999"/>
-            </w:tcBorders>
-            <w:tcMar>
-              <w:top w:w="40" w:type="dxa"/>
-              <w:left w:w="80" w:type="dxa"/>
-              <w:bottom w:w="40" w:type="dxa"/>
-              <w:right w:w="80" w:type="dxa"/>
-            </w:tcMar>
-          </w:tcPr>
-          <w:p>
-            <w:pPr>
-              <w:jc w:val="center"/>
-            </w:pPr>
-            <w:r>
-              <w:rPr>
-                <w:sz w:val="18"/>
-                <w:szCs w:val="18"/>
-              </w:rPr>
-              <w:t>0.777</w:t>
-            </w:r>
-          </w:p>
-        </w:tc>
-      </w:tr>
-      <w:tr>
-        <w:tc>
-          <w:tcPr>
-            <w:tcW w:w="0" w:type="auto"/>
-            <w:tcBorders>
-              <w:top w:val="single" w:sz="2" w:space="0" w:color="999999"/>
-              <w:left w:val="single" w:sz="2" w:space="0" w:color="999999"/>
-              <w:bottom w:val="single" w:sz="2" w:space="0" w:color="999999"/>
-              <w:right w:val="single" w:sz="2" w:space="0" w:color="999999"/>
-            </w:tcBorders>
-            <w:tcMar>
-              <w:top w:w="40" w:type="dxa"/>
-              <w:left w:w="80" w:type="dxa"/>
-              <w:bottom w:w="40" w:type="dxa"/>
-              <w:right w:w="80" w:type="dxa"/>
-            </w:tcMar>
-          </w:tcPr>
-          <w:p>
-            <w:pPr>
-              <w:jc w:val="center"/>
-            </w:pPr>
-            <w:r>
-              <w:rPr>
-                <w:sz w:val="18"/>
-                <w:szCs w:val="18"/>
-              </w:rPr>
-              <w:t>Al₂O₃</w:t>
-            </w:r>
-          </w:p>
-        </w:tc>
-        <w:tc>
-          <w:tcPr>
-            <w:tcW w:w="0" w:type="auto"/>
-            <w:tcBorders>
-              <w:top w:val="single" w:sz="2" w:space="0" w:color="999999"/>
-              <w:left w:val="single" w:sz="2" w:space="0" w:color="999999"/>
-              <w:bottom w:val="single" w:sz="2" w:space="0" w:color="999999"/>
-              <w:right w:val="single" w:sz="2" w:space="0" w:color="999999"/>
-            </w:tcBorders>
-            <w:tcMar>
-              <w:top w:w="40" w:type="dxa"/>
-              <w:left w:w="80" w:type="dxa"/>
-              <w:bottom w:w="40" w:type="dxa"/>
-              <w:right w:w="80" w:type="dxa"/>
-            </w:tcMar>
-          </w:tcPr>
-          <w:p>
-            <w:pPr>
-              <w:jc w:val="center"/>
-            </w:pPr>
-            <w:r>
-              <w:rPr>
-                <w:sz w:val="18"/>
-                <w:szCs w:val="18"/>
-              </w:rPr>
-              <w:t>18</w:t>
-            </w:r>
-          </w:p>
-        </w:tc>
-        <w:tc>
-          <w:tcPr>
-            <w:tcW w:w="0" w:type="auto"/>
-            <w:tcBorders>
-              <w:top w:val="single" w:sz="2" w:space="0" w:color="999999"/>
-              <w:left w:val="single" w:sz="2" w:space="0" w:color="999999"/>
-              <w:bottom w:val="single" w:sz="2" w:space="0" w:color="999999"/>
-              <w:right w:val="single" w:sz="2" w:space="0" w:color="999999"/>
-            </w:tcBorders>
-            <w:tcMar>
-              <w:top w:w="40" w:type="dxa"/>
-              <w:left w:w="80" w:type="dxa"/>
-              <w:bottom w:w="40" w:type="dxa"/>
-              <w:right w:w="80" w:type="dxa"/>
-            </w:tcMar>
-          </w:tcPr>
-          <w:p>
-            <w:pPr>
-              <w:jc w:val="center"/>
-            </w:pPr>
-            <w:r>
-              <w:rPr>
-                <w:sz w:val="18"/>
-                <w:szCs w:val="18"/>
-              </w:rPr>
-              <w:t>0</w:t>
-            </w:r>
-          </w:p>
-        </w:tc>
-        <w:tc>
-          <w:tcPr>
-            <w:tcW w:w="0" w:type="auto"/>
-            <w:tcBorders>
-              <w:top w:val="single" w:sz="2" w:space="0" w:color="999999"/>
-              <w:left w:val="single" w:sz="2" w:space="0" w:color="999999"/>
-              <w:bottom w:val="single" w:sz="2" w:space="0" w:color="999999"/>
-              <w:right w:val="single" w:sz="2" w:space="0" w:color="999999"/>
-            </w:tcBorders>
-            <w:tcMar>
-              <w:top w:w="40" w:type="dxa"/>
-              <w:left w:w="80" w:type="dxa"/>
-              <w:bottom w:w="40" w:type="dxa"/>
-              <w:right w:w="80" w:type="dxa"/>
-            </w:tcMar>
-          </w:tcPr>
-          <w:p>
-            <w:pPr>
-              <w:jc w:val="center"/>
-            </w:pPr>
-            <w:r>
-              <w:rPr>
-                <w:sz w:val="18"/>
-                <w:szCs w:val="18"/>
-              </w:rPr>
-              <w:t>NA (single-class)</w:t>
-            </w:r>
-          </w:p>
-        </w:tc>
-      </w:tr>
-      <w:tr>
-        <w:tc>
-          <w:tcPr>
-            <w:tcW w:w="0" w:type="auto"/>
-            <w:tcBorders>
-              <w:top w:val="single" w:sz="2" w:space="0" w:color="999999"/>
-              <w:left w:val="single" w:sz="2" w:space="0" w:color="999999"/>
-              <w:bottom w:val="single" w:sz="2" w:space="0" w:color="999999"/>
-              <w:right w:val="single" w:sz="2" w:space="0" w:color="999999"/>
-            </w:tcBorders>
-            <w:tcMar>
-              <w:top w:w="40" w:type="dxa"/>
-              <w:left w:w="80" w:type="dxa"/>
-              <w:bottom w:w="40" w:type="dxa"/>
-              <w:right w:w="80" w:type="dxa"/>
-            </w:tcMar>
-          </w:tcPr>
-          <w:p>
-            <w:pPr>
-              <w:jc w:val="center"/>
-            </w:pPr>
-            <w:r>
-              <w:rPr>
-                <w:sz w:val="18"/>
-                <w:szCs w:val="18"/>
-              </w:rPr>
-              <w:t>Fe₂O₃</w:t>
-            </w:r>
-          </w:p>
-        </w:tc>
-        <w:tc>
-          <w:tcPr>
-            <w:tcW w:w="0" w:type="auto"/>
-            <w:tcBorders>
-              <w:top w:val="single" w:sz="2" w:space="0" w:color="999999"/>
-              <w:left w:val="single" w:sz="2" w:space="0" w:color="999999"/>
-              <w:bottom w:val="single" w:sz="2" w:space="0" w:color="999999"/>
-              <w:right w:val="single" w:sz="2" w:space="0" w:color="999999"/>
-            </w:tcBorders>
-            <w:tcMar>
-              <w:top w:w="40" w:type="dxa"/>
-              <w:left w:w="80" w:type="dxa"/>
-              <w:bottom w:w="40" w:type="dxa"/>
-              <w:right w:w="80" w:type="dxa"/>
-            </w:tcMar>
-          </w:tcPr>
-          <w:p>
-            <w:pPr>
-              <w:jc w:val="center"/>
-            </w:pPr>
-            <w:r>
-              <w:rPr>
-                <w:sz w:val="18"/>
-                <w:szCs w:val="18"/>
-              </w:rPr>
-              <w:t>18</w:t>
-            </w:r>
-          </w:p>
-        </w:tc>
-        <w:tc>
-          <w:tcPr>
-            <w:tcW w:w="0" w:type="auto"/>
-            <w:tcBorders>
-              <w:top w:val="single" w:sz="2" w:space="0" w:color="999999"/>
-              <w:left w:val="single" w:sz="2" w:space="0" w:color="999999"/>
-              <w:bottom w:val="single" w:sz="2" w:space="0" w:color="999999"/>
-              <w:right w:val="single" w:sz="2" w:space="0" w:color="999999"/>
-            </w:tcBorders>
-            <w:tcMar>
-              <w:top w:w="40" w:type="dxa"/>
-              <w:left w:w="80" w:type="dxa"/>
-              <w:bottom w:w="40" w:type="dxa"/>
-              <w:right w:w="80" w:type="dxa"/>
-            </w:tcMar>
-          </w:tcPr>
-          <w:p>
-            <w:pPr>
-              <w:jc w:val="center"/>
-            </w:pPr>
-            <w:r>
-              <w:rPr>
-                <w:sz w:val="18"/>
-                <w:szCs w:val="18"/>
-              </w:rPr>
-              <w:t>0</w:t>
-            </w:r>
-          </w:p>
-        </w:tc>
-        <w:tc>
-          <w:tcPr>
-            <w:tcW w:w="0" w:type="auto"/>
-            <w:tcBorders>
-              <w:top w:val="single" w:sz="2" w:space="0" w:color="999999"/>
-              <w:left w:val="single" w:sz="2" w:space="0" w:color="999999"/>
-              <w:bottom w:val="single" w:sz="2" w:space="0" w:color="999999"/>
-              <w:right w:val="single" w:sz="2" w:space="0" w:color="999999"/>
-            </w:tcBorders>
-            <w:tcMar>
-              <w:top w:w="40" w:type="dxa"/>
-              <w:left w:w="80" w:type="dxa"/>
-              <w:bottom w:w="40" w:type="dxa"/>
-              <w:right w:w="80" w:type="dxa"/>
-            </w:tcMar>
-          </w:tcPr>
-          <w:p>
-            <w:pPr>
-              <w:jc w:val="center"/>
-            </w:pPr>
-            <w:r>
-              <w:rPr>
-                <w:sz w:val="18"/>
-                <w:szCs w:val="18"/>
-              </w:rPr>
-              <w:t>NA (single-class)</w:t>
-            </w:r>
-          </w:p>
-        </w:tc>
-      </w:tr>
-      <w:tr>
-        <w:tc>
-          <w:tcPr>
-            <w:tcW w:w="0" w:type="auto"/>
-            <w:tcBorders>
-              <w:top w:val="single" w:sz="2" w:space="0" w:color="999999"/>
-              <w:left w:val="single" w:sz="2" w:space="0" w:color="999999"/>
-              <w:bottom w:val="single" w:sz="2" w:space="0" w:color="999999"/>
-              <w:right w:val="single" w:sz="2" w:space="0" w:color="999999"/>
-            </w:tcBorders>
-            <w:tcMar>
-              <w:top w:w="40" w:type="dxa"/>
-              <w:left w:w="80" w:type="dxa"/>
-              <w:bottom w:w="40" w:type="dxa"/>
-              <w:right w:w="80" w:type="dxa"/>
-            </w:tcMar>
-          </w:tcPr>
-          <w:p>
-            <w:pPr>
-              <w:jc w:val="center"/>
-            </w:pPr>
-            <w:r>
-              <w:rPr>
-                <w:sz w:val="18"/>
-                <w:szCs w:val="18"/>
-              </w:rPr>
-              <w:t>Pooled</w:t>
-            </w:r>
-          </w:p>
-        </w:tc>
-        <w:tc>
-          <w:tcPr>
-            <w:tcW w:w="0" w:type="auto"/>
-            <w:tcBorders>
-              <w:top w:val="single" w:sz="2" w:space="0" w:color="999999"/>
-              <w:left w:val="single" w:sz="2" w:space="0" w:color="999999"/>
-              <w:bottom w:val="single" w:sz="2" w:space="0" w:color="999999"/>
-              <w:right w:val="single" w:sz="2" w:space="0" w:color="999999"/>
-            </w:tcBorders>
-            <w:tcMar>
-              <w:top w:w="40" w:type="dxa"/>
-              <w:left w:w="80" w:type="dxa"/>
-              <w:bottom w:w="40" w:type="dxa"/>
-              <w:right w:w="80" w:type="dxa"/>
-            </w:tcMar>
-          </w:tcPr>
-          <w:p>
-            <w:pPr>
-              <w:jc w:val="center"/>
-            </w:pPr>
-            <w:r>
-              <w:rPr>
-                <w:sz w:val="18"/>
-                <w:szCs w:val="18"/>
-              </w:rPr>
-              <w:t>364</w:t>
-            </w:r>
-          </w:p>
-        </w:tc>
-        <w:tc>
-          <w:tcPr>
-            <w:tcW w:w="0" w:type="auto"/>
-            <w:tcBorders>
-              <w:top w:val="single" w:sz="2" w:space="0" w:color="999999"/>
-              <w:left w:val="single" w:sz="2" w:space="0" w:color="999999"/>
-              <w:bottom w:val="single" w:sz="2" w:space="0" w:color="999999"/>
-              <w:right w:val="single" w:sz="2" w:space="0" w:color="999999"/>
-            </w:tcBorders>
-            <w:tcMar>
-              <w:top w:w="40" w:type="dxa"/>
-              <w:left w:w="80" w:type="dxa"/>
-              <w:bottom w:w="40" w:type="dxa"/>
-              <w:right w:w="80" w:type="dxa"/>
-            </w:tcMar>
-          </w:tcPr>
-          <w:p>
-            <w:pPr>
-              <w:jc w:val="center"/>
-            </w:pPr>
-            <w:r>
-              <w:rPr>
-                <w:sz w:val="18"/>
-                <w:szCs w:val="18"/>
-              </w:rPr>
-              <w:t>68</w:t>
-            </w:r>
-          </w:p>
-        </w:tc>
-        <w:tc>
-          <w:tcPr>
-            <w:tcW w:w="0" w:type="auto"/>
-            <w:tcBorders>
-              <w:top w:val="single" w:sz="2" w:space="0" w:color="999999"/>
-              <w:left w:val="single" w:sz="2" w:space="0" w:color="999999"/>
-              <w:bottom w:val="single" w:sz="2" w:space="0" w:color="999999"/>
-              <w:right w:val="single" w:sz="2" w:space="0" w:color="999999"/>
-            </w:tcBorders>
-            <w:tcMar>
-              <w:top w:w="40" w:type="dxa"/>
-              <w:left w:w="80" w:type="dxa"/>
-              <w:bottom w:w="40" w:type="dxa"/>
-              <w:right w:w="80" w:type="dxa"/>
-            </w:tcMar>
-          </w:tcPr>
-          <w:p>
-            <w:pPr>
-              <w:jc w:val="center"/>
-            </w:pPr>
-            <w:r>
-              <w:rPr>
-                <w:sz w:val="18"/>
-                <w:szCs w:val="18"/>
-              </w:rPr>
-              <w:t>−0.105</w:t>
-            </w:r>
-          </w:p>
-        </w:tc>
-      </w:tr>
-    </w:tbl>
-    <w:p>
-      <w:pPr>
-        <w:spacing w:before="80" w:after="80"/>
-      </w:pPr>
-      <w:r>
-        <w:rPr>
-          <w:i/>
-          <w:iCs/>
-          <w:sz w:val="18"/>
-          <w:szCs w:val="18"/>
-        </w:rPr>
-        <w:t xml:space="preserve">Folds for Al₂O₃ and Fe₂O₃ are undefined (single class). Pooled MCC [95% CI −0.182, −0.009]. The high CuO and TiO₂ folds rest on only 7 and 1 cytotoxic instances and are shown for transparency only.</w:t>
-      </w:r>
-    </w:p>
-    <w:p/>
-    <w:p>
-      <w:pPr>
-        <w:spacing w:before="240" w:after="80"/>
-        <w:jc w:val="both"/>
-        <w:rPr>
-          <w:rFonts w:ascii="Times New Roman" w:hAnsi="Times New Roman" w:cs="Times New Roman"/>
-        </w:rPr>
-      </w:pPr>
-      <w:r>
-        <w:rPr>
-          <w:rFonts w:ascii="Times New Roman" w:hAnsi="Times New Roman" w:cs="Times New Roman"/>
-          <w:b/>
-          <w:bCs/>
-        </w:rPr>
-        <w:t xml:space="preserve">Table S4. </w:t>
-      </w:r>
-      <w:r>
-        <w:rPr>
-          <w:rFonts w:ascii="Times New Roman" w:hAnsi="Times New Roman" w:cs="Times New Roman"/>
+          <w:sz w:val="24"/>
+          <w:szCs w:val="24"/>
         </w:rPr>
         <w:t>Feature-set decomposition under LOMO (XGBoost). MCC with 95% bootstrap CIs for the full descriptor set, dose only, and descriptors excluding dose.</w:t>
       </w:r>
@@ -4774,6 +4017,7 @@
             </w:pPr>
             <w:r>
               <w:rPr>
+                <w:rFonts w:ascii="Times New Roman" w:hAnsi="Times New Roman" w:cs="Times New Roman"/>
                 <w:b/>
                 <w:bCs/>
                 <w:sz w:val="18"/>
@@ -4806,6 +4050,7 @@
             </w:pPr>
             <w:r>
               <w:rPr>
+                <w:rFonts w:ascii="Times New Roman" w:hAnsi="Times New Roman" w:cs="Times New Roman"/>
                 <w:b/>
                 <w:bCs/>
                 <w:sz w:val="18"/>
@@ -4838,6 +4083,7 @@
             </w:pPr>
             <w:r>
               <w:rPr>
+                <w:rFonts w:ascii="Times New Roman" w:hAnsi="Times New Roman" w:cs="Times New Roman"/>
                 <w:b/>
                 <w:bCs/>
                 <w:sz w:val="18"/>
@@ -4870,12 +4116,13 @@
             </w:pPr>
             <w:r>
               <w:rPr>
+                <w:rFonts w:ascii="Times New Roman" w:hAnsi="Times New Roman" w:cs="Times New Roman"/>
                 <w:b/>
                 <w:bCs/>
                 <w:sz w:val="18"/>
                 <w:szCs w:val="18"/>
               </w:rPr>
-              <w:t>≈ chance</w:t>
+              <w:t>95% CI spans zero</w:t>
             </w:r>
           </w:p>
         </w:tc>
@@ -4903,6 +4150,7 @@
             </w:pPr>
             <w:r>
               <w:rPr>
+                <w:rFonts w:ascii="Times New Roman" w:hAnsi="Times New Roman" w:cs="Times New Roman"/>
                 <w:sz w:val="18"/>
                 <w:szCs w:val="18"/>
               </w:rPr>
@@ -4932,6 +4180,7 @@
             </w:pPr>
             <w:r>
               <w:rPr>
+                <w:rFonts w:ascii="Times New Roman" w:hAnsi="Times New Roman" w:cs="Times New Roman"/>
                 <w:sz w:val="18"/>
                 <w:szCs w:val="18"/>
               </w:rPr>
@@ -4961,6 +4210,7 @@
             </w:pPr>
             <w:r>
               <w:rPr>
+                <w:rFonts w:ascii="Times New Roman" w:hAnsi="Times New Roman" w:cs="Times New Roman"/>
                 <w:sz w:val="18"/>
                 <w:szCs w:val="18"/>
               </w:rPr>
@@ -4990,6 +4240,7 @@
             </w:pPr>
             <w:r>
               <w:rPr>
+                <w:rFonts w:ascii="Times New Roman" w:hAnsi="Times New Roman" w:cs="Times New Roman"/>
                 <w:sz w:val="18"/>
                 <w:szCs w:val="18"/>
               </w:rPr>
@@ -5021,6 +4272,7 @@
             </w:pPr>
             <w:r>
               <w:rPr>
+                <w:rFonts w:ascii="Times New Roman" w:hAnsi="Times New Roman" w:cs="Times New Roman"/>
                 <w:sz w:val="18"/>
                 <w:szCs w:val="18"/>
               </w:rPr>
@@ -5050,6 +4302,7 @@
             </w:pPr>
             <w:r>
               <w:rPr>
+                <w:rFonts w:ascii="Times New Roman" w:hAnsi="Times New Roman" w:cs="Times New Roman"/>
                 <w:sz w:val="18"/>
                 <w:szCs w:val="18"/>
               </w:rPr>
@@ -5079,6 +4332,7 @@
             </w:pPr>
             <w:r>
               <w:rPr>
+                <w:rFonts w:ascii="Times New Roman" w:hAnsi="Times New Roman" w:cs="Times New Roman"/>
                 <w:sz w:val="18"/>
                 <w:szCs w:val="18"/>
               </w:rPr>
@@ -5108,6 +4362,7 @@
             </w:pPr>
             <w:r>
               <w:rPr>
+                <w:rFonts w:ascii="Times New Roman" w:hAnsi="Times New Roman" w:cs="Times New Roman"/>
                 <w:sz w:val="18"/>
                 <w:szCs w:val="18"/>
               </w:rPr>
@@ -5139,6 +4394,7 @@
             </w:pPr>
             <w:r>
               <w:rPr>
+                <w:rFonts w:ascii="Times New Roman" w:hAnsi="Times New Roman" w:cs="Times New Roman"/>
                 <w:sz w:val="18"/>
                 <w:szCs w:val="18"/>
               </w:rPr>
@@ -5168,6 +4424,7 @@
             </w:pPr>
             <w:r>
               <w:rPr>
+                <w:rFonts w:ascii="Times New Roman" w:hAnsi="Times New Roman" w:cs="Times New Roman"/>
                 <w:sz w:val="18"/>
                 <w:szCs w:val="18"/>
               </w:rPr>
@@ -5197,6 +4454,7 @@
             </w:pPr>
             <w:r>
               <w:rPr>
+                <w:rFonts w:ascii="Times New Roman" w:hAnsi="Times New Roman" w:cs="Times New Roman"/>
                 <w:sz w:val="18"/>
                 <w:szCs w:val="18"/>
               </w:rPr>
@@ -5226,6 +4484,7 @@
             </w:pPr>
             <w:r>
               <w:rPr>
+                <w:rFonts w:ascii="Times New Roman" w:hAnsi="Times New Roman" w:cs="Times New Roman"/>
                 <w:sz w:val="18"/>
                 <w:szCs w:val="18"/>
               </w:rPr>
@@ -5241,1127 +4500,16 @@
       </w:pPr>
       <w:r>
         <w:rPr>
+          <w:rFonts w:ascii="Times New Roman" w:hAnsi="Times New Roman" w:cs="Times New Roman"/>
           <w:i/>
           <w:iCs/>
           <w:sz w:val="18"/>
           <w:szCs w:val="18"/>
         </w:rPr>
-        <w:t>All subsets produce below-chance MCCs; no subset of the available descriptors supported above-chance cross-material generalization. The dose-only row refers to XGBoost fitted on the dose descriptor alone, which is not the same as the single-variable dose-threshold baseline of Section 3.2: that baseline selects a cut maximizing training-partition MCC and applies it directly, rather than fitting a flexible model to one feature. The two are therefore not comparable, and the threshold rule's higher performance reflects the estimator rather than additional information.</w:t>
+        <w:t>All three XGBoost feature-set configurations produced negative pooled LOMO MCCs. The dose-only row refers to XGBoost fitted on the dose descriptor alone, which is not the same as the single-variable dose-threshold comparator of Section 3.2: that comparator selects a cut maximizing training-partition MCC and applies it directly, rather than fitting a flexible model to one feature. The two analyses are therefore mechanistically and statistically distinct and should not be interpreted as the same model.</w:t>
       </w:r>
     </w:p>
     <w:p/>
-    <w:p>
-      <w:pPr>
-        <w:spacing w:before="240" w:after="80"/>
-        <w:jc w:val="both"/>
-        <w:rPr>
-          <w:rFonts w:ascii="Times New Roman" w:hAnsi="Times New Roman" w:cs="Times New Roman"/>
-        </w:rPr>
-      </w:pPr>
-      <w:r>
-        <w:rPr>
-          <w:rFonts w:ascii="Times New Roman" w:hAnsi="Times New Roman" w:cs="Times New Roman"/>
-          <w:b/>
-          <w:bCs/>
-        </w:rPr>
-        <w:t xml:space="preserve">Table S5. </w:t>
-      </w:r>
-      <w:r>
-        <w:rPr>
-          <w:rFonts w:ascii="Times New Roman" w:hAnsi="Times New Roman" w:cs="Times New Roman"/>
-        </w:rPr>
-        <w:t>Class frequencies within each leave-one-oxide-out fold. For each held-out oxide, the number of cytotoxic and non-cytotoxic held-out instances and the cytotoxic fraction.</w:t>
-      </w:r>
-    </w:p>
-    <w:tbl>
-      <w:tblPr>
-        <w:tblW w:w="5000" w:type="pct"/>
-        <w:tblBorders>
-          <w:top w:val="single" w:sz="4" w:space="0" w:color="auto"/>
-          <w:left w:val="single" w:sz="4" w:space="0" w:color="auto"/>
-          <w:bottom w:val="single" w:sz="4" w:space="0" w:color="auto"/>
-          <w:right w:val="single" w:sz="4" w:space="0" w:color="auto"/>
-          <w:insideH w:val="single" w:sz="4" w:space="0" w:color="auto"/>
-          <w:insideV w:val="single" w:sz="4" w:space="0" w:color="auto"/>
-        </w:tblBorders>
-        <w:tblCellMar>
-          <w:left w:w="10" w:type="dxa"/>
-          <w:right w:w="10" w:type="dxa"/>
-        </w:tblCellMar>
-        <w:tblLook w:val="0000" w:firstRow="0" w:lastRow="0" w:firstColumn="0" w:lastColumn="0" w:noHBand="0" w:noVBand="0"/>
-      </w:tblPr>
-      <w:tblGrid>
-        <w:gridCol w:w="2023"/>
-        <w:gridCol w:w="1651"/>
-        <w:gridCol w:w="1376"/>
-        <w:gridCol w:w="1930"/>
-        <w:gridCol w:w="2374"/>
-      </w:tblGrid>
-      <w:tr>
-        <w:tc>
-          <w:tcPr>
-            <w:tcW w:w="0" w:type="auto"/>
-            <w:tcBorders>
-              <w:top w:val="single" w:sz="2" w:space="0" w:color="999999"/>
-              <w:left w:val="single" w:sz="2" w:space="0" w:color="999999"/>
-              <w:bottom w:val="single" w:sz="2" w:space="0" w:color="999999"/>
-              <w:right w:val="single" w:sz="2" w:space="0" w:color="999999"/>
-            </w:tcBorders>
-            <w:shd w:val="clear" w:color="auto" w:fill="F2F2F2"/>
-            <w:tcMar>
-              <w:top w:w="40" w:type="dxa"/>
-              <w:left w:w="80" w:type="dxa"/>
-              <w:bottom w:w="40" w:type="dxa"/>
-              <w:right w:w="80" w:type="dxa"/>
-            </w:tcMar>
-          </w:tcPr>
-          <w:p>
-            <w:pPr>
-              <w:jc w:val="center"/>
-            </w:pPr>
-            <w:r>
-              <w:rPr>
-                <w:b/>
-                <w:bCs/>
-                <w:sz w:val="18"/>
-                <w:szCs w:val="18"/>
-              </w:rPr>
-              <w:t>Held-out oxide</w:t>
-            </w:r>
-          </w:p>
-        </w:tc>
-        <w:tc>
-          <w:tcPr>
-            <w:tcW w:w="0" w:type="auto"/>
-            <w:tcBorders>
-              <w:top w:val="single" w:sz="2" w:space="0" w:color="999999"/>
-              <w:left w:val="single" w:sz="2" w:space="0" w:color="999999"/>
-              <w:bottom w:val="single" w:sz="2" w:space="0" w:color="999999"/>
-              <w:right w:val="single" w:sz="2" w:space="0" w:color="999999"/>
-            </w:tcBorders>
-            <w:shd w:val="clear" w:color="auto" w:fill="F2F2F2"/>
-            <w:tcMar>
-              <w:top w:w="40" w:type="dxa"/>
-              <w:left w:w="80" w:type="dxa"/>
-              <w:bottom w:w="40" w:type="dxa"/>
-              <w:right w:w="80" w:type="dxa"/>
-            </w:tcMar>
-          </w:tcPr>
-          <w:p>
-            <w:pPr>
-              <w:jc w:val="center"/>
-            </w:pPr>
-            <w:r>
-              <w:rPr>
-                <w:b/>
-                <w:bCs/>
-                <w:sz w:val="18"/>
-                <w:szCs w:val="18"/>
-              </w:rPr>
-              <w:t>n (held out)</w:t>
-            </w:r>
-          </w:p>
-        </w:tc>
-        <w:tc>
-          <w:tcPr>
-            <w:tcW w:w="0" w:type="auto"/>
-            <w:tcBorders>
-              <w:top w:val="single" w:sz="2" w:space="0" w:color="999999"/>
-              <w:left w:val="single" w:sz="2" w:space="0" w:color="999999"/>
-              <w:bottom w:val="single" w:sz="2" w:space="0" w:color="999999"/>
-              <w:right w:val="single" w:sz="2" w:space="0" w:color="999999"/>
-            </w:tcBorders>
-            <w:shd w:val="clear" w:color="auto" w:fill="F2F2F2"/>
-            <w:tcMar>
-              <w:top w:w="40" w:type="dxa"/>
-              <w:left w:w="80" w:type="dxa"/>
-              <w:bottom w:w="40" w:type="dxa"/>
-              <w:right w:w="80" w:type="dxa"/>
-            </w:tcMar>
-          </w:tcPr>
-          <w:p>
-            <w:pPr>
-              <w:jc w:val="center"/>
-            </w:pPr>
-            <w:r>
-              <w:rPr>
-                <w:b/>
-                <w:bCs/>
-                <w:sz w:val="18"/>
-                <w:szCs w:val="18"/>
-              </w:rPr>
-              <w:t>Cytotoxic</w:t>
-            </w:r>
-          </w:p>
-        </w:tc>
-        <w:tc>
-          <w:tcPr>
-            <w:tcW w:w="0" w:type="auto"/>
-            <w:tcBorders>
-              <w:top w:val="single" w:sz="2" w:space="0" w:color="999999"/>
-              <w:left w:val="single" w:sz="2" w:space="0" w:color="999999"/>
-              <w:bottom w:val="single" w:sz="2" w:space="0" w:color="999999"/>
-              <w:right w:val="single" w:sz="2" w:space="0" w:color="999999"/>
-            </w:tcBorders>
-            <w:shd w:val="clear" w:color="auto" w:fill="F2F2F2"/>
-            <w:tcMar>
-              <w:top w:w="40" w:type="dxa"/>
-              <w:left w:w="80" w:type="dxa"/>
-              <w:bottom w:w="40" w:type="dxa"/>
-              <w:right w:w="80" w:type="dxa"/>
-            </w:tcMar>
-          </w:tcPr>
-          <w:p>
-            <w:pPr>
-              <w:jc w:val="center"/>
-            </w:pPr>
-            <w:r>
-              <w:rPr>
-                <w:b/>
-                <w:bCs/>
-                <w:sz w:val="18"/>
-                <w:szCs w:val="18"/>
-              </w:rPr>
-              <w:t>Non-cytotoxic</w:t>
-            </w:r>
-          </w:p>
-        </w:tc>
-        <w:tc>
-          <w:tcPr>
-            <w:tcW w:w="0" w:type="auto"/>
-            <w:tcBorders>
-              <w:top w:val="single" w:sz="2" w:space="0" w:color="999999"/>
-              <w:left w:val="single" w:sz="2" w:space="0" w:color="999999"/>
-              <w:bottom w:val="single" w:sz="2" w:space="0" w:color="999999"/>
-              <w:right w:val="single" w:sz="2" w:space="0" w:color="999999"/>
-            </w:tcBorders>
-            <w:shd w:val="clear" w:color="auto" w:fill="F2F2F2"/>
-            <w:tcMar>
-              <w:top w:w="40" w:type="dxa"/>
-              <w:left w:w="80" w:type="dxa"/>
-              <w:bottom w:w="40" w:type="dxa"/>
-              <w:right w:w="80" w:type="dxa"/>
-            </w:tcMar>
-          </w:tcPr>
-          <w:p>
-            <w:pPr>
-              <w:jc w:val="center"/>
-            </w:pPr>
-            <w:r>
-              <w:rPr>
-                <w:b/>
-                <w:bCs/>
-                <w:sz w:val="18"/>
-                <w:szCs w:val="18"/>
-              </w:rPr>
-              <w:t>Cytotoxic fraction</w:t>
-            </w:r>
-          </w:p>
-        </w:tc>
-      </w:tr>
-      <w:tr>
-        <w:tc>
-          <w:tcPr>
-            <w:tcW w:w="0" w:type="auto"/>
-            <w:tcBorders>
-              <w:top w:val="single" w:sz="2" w:space="0" w:color="999999"/>
-              <w:left w:val="single" w:sz="2" w:space="0" w:color="999999"/>
-              <w:bottom w:val="single" w:sz="2" w:space="0" w:color="999999"/>
-              <w:right w:val="single" w:sz="2" w:space="0" w:color="999999"/>
-            </w:tcBorders>
-            <w:tcMar>
-              <w:top w:w="40" w:type="dxa"/>
-              <w:left w:w="80" w:type="dxa"/>
-              <w:bottom w:w="40" w:type="dxa"/>
-              <w:right w:w="80" w:type="dxa"/>
-            </w:tcMar>
-          </w:tcPr>
-          <w:p>
-            <w:pPr>
-              <w:jc w:val="center"/>
-            </w:pPr>
-            <w:r>
-              <w:rPr>
-                <w:sz w:val="18"/>
-                <w:szCs w:val="18"/>
-              </w:rPr>
-              <w:t>ZnO</w:t>
-            </w:r>
-          </w:p>
-        </w:tc>
-        <w:tc>
-          <w:tcPr>
-            <w:tcW w:w="0" w:type="auto"/>
-            <w:tcBorders>
-              <w:top w:val="single" w:sz="2" w:space="0" w:color="999999"/>
-              <w:left w:val="single" w:sz="2" w:space="0" w:color="999999"/>
-              <w:bottom w:val="single" w:sz="2" w:space="0" w:color="999999"/>
-              <w:right w:val="single" w:sz="2" w:space="0" w:color="999999"/>
-            </w:tcBorders>
-            <w:tcMar>
-              <w:top w:w="40" w:type="dxa"/>
-              <w:left w:w="80" w:type="dxa"/>
-              <w:bottom w:w="40" w:type="dxa"/>
-              <w:right w:w="80" w:type="dxa"/>
-            </w:tcMar>
-          </w:tcPr>
-          <w:p>
-            <w:pPr>
-              <w:jc w:val="center"/>
-            </w:pPr>
-            <w:r>
-              <w:rPr>
-                <w:sz w:val="18"/>
-                <w:szCs w:val="18"/>
-              </w:rPr>
-              <w:t>190</w:t>
-            </w:r>
-          </w:p>
-        </w:tc>
-        <w:tc>
-          <w:tcPr>
-            <w:tcW w:w="0" w:type="auto"/>
-            <w:tcBorders>
-              <w:top w:val="single" w:sz="2" w:space="0" w:color="999999"/>
-              <w:left w:val="single" w:sz="2" w:space="0" w:color="999999"/>
-              <w:bottom w:val="single" w:sz="2" w:space="0" w:color="999999"/>
-              <w:right w:val="single" w:sz="2" w:space="0" w:color="999999"/>
-            </w:tcBorders>
-            <w:tcMar>
-              <w:top w:w="40" w:type="dxa"/>
-              <w:left w:w="80" w:type="dxa"/>
-              <w:bottom w:w="40" w:type="dxa"/>
-              <w:right w:w="80" w:type="dxa"/>
-            </w:tcMar>
-          </w:tcPr>
-          <w:p>
-            <w:pPr>
-              <w:jc w:val="center"/>
-            </w:pPr>
-            <w:r>
-              <w:rPr>
-                <w:sz w:val="18"/>
-                <w:szCs w:val="18"/>
-              </w:rPr>
-              <w:t>60</w:t>
-            </w:r>
-          </w:p>
-        </w:tc>
-        <w:tc>
-          <w:tcPr>
-            <w:tcW w:w="0" w:type="auto"/>
-            <w:tcBorders>
-              <w:top w:val="single" w:sz="2" w:space="0" w:color="999999"/>
-              <w:left w:val="single" w:sz="2" w:space="0" w:color="999999"/>
-              <w:bottom w:val="single" w:sz="2" w:space="0" w:color="999999"/>
-              <w:right w:val="single" w:sz="2" w:space="0" w:color="999999"/>
-            </w:tcBorders>
-            <w:tcMar>
-              <w:top w:w="40" w:type="dxa"/>
-              <w:left w:w="80" w:type="dxa"/>
-              <w:bottom w:w="40" w:type="dxa"/>
-              <w:right w:w="80" w:type="dxa"/>
-            </w:tcMar>
-          </w:tcPr>
-          <w:p>
-            <w:pPr>
-              <w:jc w:val="center"/>
-            </w:pPr>
-            <w:r>
-              <w:rPr>
-                <w:sz w:val="18"/>
-                <w:szCs w:val="18"/>
-              </w:rPr>
-              <w:t>130</w:t>
-            </w:r>
-          </w:p>
-        </w:tc>
-        <w:tc>
-          <w:tcPr>
-            <w:tcW w:w="0" w:type="auto"/>
-            <w:tcBorders>
-              <w:top w:val="single" w:sz="2" w:space="0" w:color="999999"/>
-              <w:left w:val="single" w:sz="2" w:space="0" w:color="999999"/>
-              <w:bottom w:val="single" w:sz="2" w:space="0" w:color="999999"/>
-              <w:right w:val="single" w:sz="2" w:space="0" w:color="999999"/>
-            </w:tcBorders>
-            <w:tcMar>
-              <w:top w:w="40" w:type="dxa"/>
-              <w:left w:w="80" w:type="dxa"/>
-              <w:bottom w:w="40" w:type="dxa"/>
-              <w:right w:w="80" w:type="dxa"/>
-            </w:tcMar>
-          </w:tcPr>
-          <w:p>
-            <w:pPr>
-              <w:jc w:val="center"/>
-            </w:pPr>
-            <w:r>
-              <w:rPr>
-                <w:sz w:val="18"/>
-                <w:szCs w:val="18"/>
-              </w:rPr>
-              <w:t>0.316</w:t>
-            </w:r>
-          </w:p>
-        </w:tc>
-      </w:tr>
-      <w:tr>
-        <w:tc>
-          <w:tcPr>
-            <w:tcW w:w="0" w:type="auto"/>
-            <w:tcBorders>
-              <w:top w:val="single" w:sz="2" w:space="0" w:color="999999"/>
-              <w:left w:val="single" w:sz="2" w:space="0" w:color="999999"/>
-              <w:bottom w:val="single" w:sz="2" w:space="0" w:color="999999"/>
-              <w:right w:val="single" w:sz="2" w:space="0" w:color="999999"/>
-            </w:tcBorders>
-            <w:tcMar>
-              <w:top w:w="40" w:type="dxa"/>
-              <w:left w:w="80" w:type="dxa"/>
-              <w:bottom w:w="40" w:type="dxa"/>
-              <w:right w:w="80" w:type="dxa"/>
-            </w:tcMar>
-          </w:tcPr>
-          <w:p>
-            <w:pPr>
-              <w:jc w:val="center"/>
-            </w:pPr>
-            <w:r>
-              <w:rPr>
-                <w:sz w:val="18"/>
-                <w:szCs w:val="18"/>
-              </w:rPr>
-              <w:t>TiO₂</w:t>
-            </w:r>
-          </w:p>
-        </w:tc>
-        <w:tc>
-          <w:tcPr>
-            <w:tcW w:w="0" w:type="auto"/>
-            <w:tcBorders>
-              <w:top w:val="single" w:sz="2" w:space="0" w:color="999999"/>
-              <w:left w:val="single" w:sz="2" w:space="0" w:color="999999"/>
-              <w:bottom w:val="single" w:sz="2" w:space="0" w:color="999999"/>
-              <w:right w:val="single" w:sz="2" w:space="0" w:color="999999"/>
-            </w:tcBorders>
-            <w:tcMar>
-              <w:top w:w="40" w:type="dxa"/>
-              <w:left w:w="80" w:type="dxa"/>
-              <w:bottom w:w="40" w:type="dxa"/>
-              <w:right w:w="80" w:type="dxa"/>
-            </w:tcMar>
-          </w:tcPr>
-          <w:p>
-            <w:pPr>
-              <w:jc w:val="center"/>
-            </w:pPr>
-            <w:r>
-              <w:rPr>
-                <w:sz w:val="18"/>
-                <w:szCs w:val="18"/>
-              </w:rPr>
-              <w:t>120</w:t>
-            </w:r>
-          </w:p>
-        </w:tc>
-        <w:tc>
-          <w:tcPr>
-            <w:tcW w:w="0" w:type="auto"/>
-            <w:tcBorders>
-              <w:top w:val="single" w:sz="2" w:space="0" w:color="999999"/>
-              <w:left w:val="single" w:sz="2" w:space="0" w:color="999999"/>
-              <w:bottom w:val="single" w:sz="2" w:space="0" w:color="999999"/>
-              <w:right w:val="single" w:sz="2" w:space="0" w:color="999999"/>
-            </w:tcBorders>
-            <w:tcMar>
-              <w:top w:w="40" w:type="dxa"/>
-              <w:left w:w="80" w:type="dxa"/>
-              <w:bottom w:w="40" w:type="dxa"/>
-              <w:right w:w="80" w:type="dxa"/>
-            </w:tcMar>
-          </w:tcPr>
-          <w:p>
-            <w:pPr>
-              <w:jc w:val="center"/>
-            </w:pPr>
-            <w:r>
-              <w:rPr>
-                <w:sz w:val="18"/>
-                <w:szCs w:val="18"/>
-              </w:rPr>
-              <w:t>1</w:t>
-            </w:r>
-          </w:p>
-        </w:tc>
-        <w:tc>
-          <w:tcPr>
-            <w:tcW w:w="0" w:type="auto"/>
-            <w:tcBorders>
-              <w:top w:val="single" w:sz="2" w:space="0" w:color="999999"/>
-              <w:left w:val="single" w:sz="2" w:space="0" w:color="999999"/>
-              <w:bottom w:val="single" w:sz="2" w:space="0" w:color="999999"/>
-              <w:right w:val="single" w:sz="2" w:space="0" w:color="999999"/>
-            </w:tcBorders>
-            <w:tcMar>
-              <w:top w:w="40" w:type="dxa"/>
-              <w:left w:w="80" w:type="dxa"/>
-              <w:bottom w:w="40" w:type="dxa"/>
-              <w:right w:w="80" w:type="dxa"/>
-            </w:tcMar>
-          </w:tcPr>
-          <w:p>
-            <w:pPr>
-              <w:jc w:val="center"/>
-            </w:pPr>
-            <w:r>
-              <w:rPr>
-                <w:sz w:val="18"/>
-                <w:szCs w:val="18"/>
-              </w:rPr>
-              <w:t>119</w:t>
-            </w:r>
-          </w:p>
-        </w:tc>
-        <w:tc>
-          <w:tcPr>
-            <w:tcW w:w="0" w:type="auto"/>
-            <w:tcBorders>
-              <w:top w:val="single" w:sz="2" w:space="0" w:color="999999"/>
-              <w:left w:val="single" w:sz="2" w:space="0" w:color="999999"/>
-              <w:bottom w:val="single" w:sz="2" w:space="0" w:color="999999"/>
-              <w:right w:val="single" w:sz="2" w:space="0" w:color="999999"/>
-            </w:tcBorders>
-            <w:tcMar>
-              <w:top w:w="40" w:type="dxa"/>
-              <w:left w:w="80" w:type="dxa"/>
-              <w:bottom w:w="40" w:type="dxa"/>
-              <w:right w:w="80" w:type="dxa"/>
-            </w:tcMar>
-          </w:tcPr>
-          <w:p>
-            <w:pPr>
-              <w:jc w:val="center"/>
-            </w:pPr>
-            <w:r>
-              <w:rPr>
-                <w:sz w:val="18"/>
-                <w:szCs w:val="18"/>
-              </w:rPr>
-              <w:t>0.008</w:t>
-            </w:r>
-          </w:p>
-        </w:tc>
-      </w:tr>
-      <w:tr>
-        <w:tc>
-          <w:tcPr>
-            <w:tcW w:w="0" w:type="auto"/>
-            <w:tcBorders>
-              <w:top w:val="single" w:sz="2" w:space="0" w:color="999999"/>
-              <w:left w:val="single" w:sz="2" w:space="0" w:color="999999"/>
-              <w:bottom w:val="single" w:sz="2" w:space="0" w:color="999999"/>
-              <w:right w:val="single" w:sz="2" w:space="0" w:color="999999"/>
-            </w:tcBorders>
-            <w:tcMar>
-              <w:top w:w="40" w:type="dxa"/>
-              <w:left w:w="80" w:type="dxa"/>
-              <w:bottom w:w="40" w:type="dxa"/>
-              <w:right w:w="80" w:type="dxa"/>
-            </w:tcMar>
-          </w:tcPr>
-          <w:p>
-            <w:pPr>
-              <w:jc w:val="center"/>
-            </w:pPr>
-            <w:r>
-              <w:rPr>
-                <w:sz w:val="18"/>
-                <w:szCs w:val="18"/>
-              </w:rPr>
-              <w:t>CuO</w:t>
-            </w:r>
-          </w:p>
-        </w:tc>
-        <w:tc>
-          <w:tcPr>
-            <w:tcW w:w="0" w:type="auto"/>
-            <w:tcBorders>
-              <w:top w:val="single" w:sz="2" w:space="0" w:color="999999"/>
-              <w:left w:val="single" w:sz="2" w:space="0" w:color="999999"/>
-              <w:bottom w:val="single" w:sz="2" w:space="0" w:color="999999"/>
-              <w:right w:val="single" w:sz="2" w:space="0" w:color="999999"/>
-            </w:tcBorders>
-            <w:tcMar>
-              <w:top w:w="40" w:type="dxa"/>
-              <w:left w:w="80" w:type="dxa"/>
-              <w:bottom w:w="40" w:type="dxa"/>
-              <w:right w:w="80" w:type="dxa"/>
-            </w:tcMar>
-          </w:tcPr>
-          <w:p>
-            <w:pPr>
-              <w:jc w:val="center"/>
-            </w:pPr>
-            <w:r>
-              <w:rPr>
-                <w:sz w:val="18"/>
-                <w:szCs w:val="18"/>
-              </w:rPr>
-              <w:t>18</w:t>
-            </w:r>
-          </w:p>
-        </w:tc>
-        <w:tc>
-          <w:tcPr>
-            <w:tcW w:w="0" w:type="auto"/>
-            <w:tcBorders>
-              <w:top w:val="single" w:sz="2" w:space="0" w:color="999999"/>
-              <w:left w:val="single" w:sz="2" w:space="0" w:color="999999"/>
-              <w:bottom w:val="single" w:sz="2" w:space="0" w:color="999999"/>
-              <w:right w:val="single" w:sz="2" w:space="0" w:color="999999"/>
-            </w:tcBorders>
-            <w:tcMar>
-              <w:top w:w="40" w:type="dxa"/>
-              <w:left w:w="80" w:type="dxa"/>
-              <w:bottom w:w="40" w:type="dxa"/>
-              <w:right w:w="80" w:type="dxa"/>
-            </w:tcMar>
-          </w:tcPr>
-          <w:p>
-            <w:pPr>
-              <w:jc w:val="center"/>
-            </w:pPr>
-            <w:r>
-              <w:rPr>
-                <w:sz w:val="18"/>
-                <w:szCs w:val="18"/>
-              </w:rPr>
-              <w:t>7</w:t>
-            </w:r>
-          </w:p>
-        </w:tc>
-        <w:tc>
-          <w:tcPr>
-            <w:tcW w:w="0" w:type="auto"/>
-            <w:tcBorders>
-              <w:top w:val="single" w:sz="2" w:space="0" w:color="999999"/>
-              <w:left w:val="single" w:sz="2" w:space="0" w:color="999999"/>
-              <w:bottom w:val="single" w:sz="2" w:space="0" w:color="999999"/>
-              <w:right w:val="single" w:sz="2" w:space="0" w:color="999999"/>
-            </w:tcBorders>
-            <w:tcMar>
-              <w:top w:w="40" w:type="dxa"/>
-              <w:left w:w="80" w:type="dxa"/>
-              <w:bottom w:w="40" w:type="dxa"/>
-              <w:right w:w="80" w:type="dxa"/>
-            </w:tcMar>
-          </w:tcPr>
-          <w:p>
-            <w:pPr>
-              <w:jc w:val="center"/>
-            </w:pPr>
-            <w:r>
-              <w:rPr>
-                <w:sz w:val="18"/>
-                <w:szCs w:val="18"/>
-              </w:rPr>
-              <w:t>11</w:t>
-            </w:r>
-          </w:p>
-        </w:tc>
-        <w:tc>
-          <w:tcPr>
-            <w:tcW w:w="0" w:type="auto"/>
-            <w:tcBorders>
-              <w:top w:val="single" w:sz="2" w:space="0" w:color="999999"/>
-              <w:left w:val="single" w:sz="2" w:space="0" w:color="999999"/>
-              <w:bottom w:val="single" w:sz="2" w:space="0" w:color="999999"/>
-              <w:right w:val="single" w:sz="2" w:space="0" w:color="999999"/>
-            </w:tcBorders>
-            <w:tcMar>
-              <w:top w:w="40" w:type="dxa"/>
-              <w:left w:w="80" w:type="dxa"/>
-              <w:bottom w:w="40" w:type="dxa"/>
-              <w:right w:w="80" w:type="dxa"/>
-            </w:tcMar>
-          </w:tcPr>
-          <w:p>
-            <w:pPr>
-              <w:jc w:val="center"/>
-            </w:pPr>
-            <w:r>
-              <w:rPr>
-                <w:sz w:val="18"/>
-                <w:szCs w:val="18"/>
-              </w:rPr>
-              <w:t>0.389</w:t>
-            </w:r>
-          </w:p>
-        </w:tc>
-      </w:tr>
-      <w:tr>
-        <w:tc>
-          <w:tcPr>
-            <w:tcW w:w="0" w:type="auto"/>
-            <w:tcBorders>
-              <w:top w:val="single" w:sz="2" w:space="0" w:color="999999"/>
-              <w:left w:val="single" w:sz="2" w:space="0" w:color="999999"/>
-              <w:bottom w:val="single" w:sz="2" w:space="0" w:color="999999"/>
-              <w:right w:val="single" w:sz="2" w:space="0" w:color="999999"/>
-            </w:tcBorders>
-            <w:tcMar>
-              <w:top w:w="40" w:type="dxa"/>
-              <w:left w:w="80" w:type="dxa"/>
-              <w:bottom w:w="40" w:type="dxa"/>
-              <w:right w:w="80" w:type="dxa"/>
-            </w:tcMar>
-          </w:tcPr>
-          <w:p>
-            <w:pPr>
-              <w:jc w:val="center"/>
-            </w:pPr>
-            <w:r>
-              <w:rPr>
-                <w:sz w:val="18"/>
-                <w:szCs w:val="18"/>
-              </w:rPr>
-              <w:t>Al₂O₃</w:t>
-            </w:r>
-          </w:p>
-        </w:tc>
-        <w:tc>
-          <w:tcPr>
-            <w:tcW w:w="0" w:type="auto"/>
-            <w:tcBorders>
-              <w:top w:val="single" w:sz="2" w:space="0" w:color="999999"/>
-              <w:left w:val="single" w:sz="2" w:space="0" w:color="999999"/>
-              <w:bottom w:val="single" w:sz="2" w:space="0" w:color="999999"/>
-              <w:right w:val="single" w:sz="2" w:space="0" w:color="999999"/>
-            </w:tcBorders>
-            <w:tcMar>
-              <w:top w:w="40" w:type="dxa"/>
-              <w:left w:w="80" w:type="dxa"/>
-              <w:bottom w:w="40" w:type="dxa"/>
-              <w:right w:w="80" w:type="dxa"/>
-            </w:tcMar>
-          </w:tcPr>
-          <w:p>
-            <w:pPr>
-              <w:jc w:val="center"/>
-            </w:pPr>
-            <w:r>
-              <w:rPr>
-                <w:sz w:val="18"/>
-                <w:szCs w:val="18"/>
-              </w:rPr>
-              <w:t>18</w:t>
-            </w:r>
-          </w:p>
-        </w:tc>
-        <w:tc>
-          <w:tcPr>
-            <w:tcW w:w="0" w:type="auto"/>
-            <w:tcBorders>
-              <w:top w:val="single" w:sz="2" w:space="0" w:color="999999"/>
-              <w:left w:val="single" w:sz="2" w:space="0" w:color="999999"/>
-              <w:bottom w:val="single" w:sz="2" w:space="0" w:color="999999"/>
-              <w:right w:val="single" w:sz="2" w:space="0" w:color="999999"/>
-            </w:tcBorders>
-            <w:tcMar>
-              <w:top w:w="40" w:type="dxa"/>
-              <w:left w:w="80" w:type="dxa"/>
-              <w:bottom w:w="40" w:type="dxa"/>
-              <w:right w:w="80" w:type="dxa"/>
-            </w:tcMar>
-          </w:tcPr>
-          <w:p>
-            <w:pPr>
-              <w:jc w:val="center"/>
-            </w:pPr>
-            <w:r>
-              <w:rPr>
-                <w:sz w:val="18"/>
-                <w:szCs w:val="18"/>
-              </w:rPr>
-              <w:t>0</w:t>
-            </w:r>
-          </w:p>
-        </w:tc>
-        <w:tc>
-          <w:tcPr>
-            <w:tcW w:w="0" w:type="auto"/>
-            <w:tcBorders>
-              <w:top w:val="single" w:sz="2" w:space="0" w:color="999999"/>
-              <w:left w:val="single" w:sz="2" w:space="0" w:color="999999"/>
-              <w:bottom w:val="single" w:sz="2" w:space="0" w:color="999999"/>
-              <w:right w:val="single" w:sz="2" w:space="0" w:color="999999"/>
-            </w:tcBorders>
-            <w:tcMar>
-              <w:top w:w="40" w:type="dxa"/>
-              <w:left w:w="80" w:type="dxa"/>
-              <w:bottom w:w="40" w:type="dxa"/>
-              <w:right w:w="80" w:type="dxa"/>
-            </w:tcMar>
-          </w:tcPr>
-          <w:p>
-            <w:pPr>
-              <w:jc w:val="center"/>
-            </w:pPr>
-            <w:r>
-              <w:rPr>
-                <w:sz w:val="18"/>
-                <w:szCs w:val="18"/>
-              </w:rPr>
-              <w:t>18</w:t>
-            </w:r>
-          </w:p>
-        </w:tc>
-        <w:tc>
-          <w:tcPr>
-            <w:tcW w:w="0" w:type="auto"/>
-            <w:tcBorders>
-              <w:top w:val="single" w:sz="2" w:space="0" w:color="999999"/>
-              <w:left w:val="single" w:sz="2" w:space="0" w:color="999999"/>
-              <w:bottom w:val="single" w:sz="2" w:space="0" w:color="999999"/>
-              <w:right w:val="single" w:sz="2" w:space="0" w:color="999999"/>
-            </w:tcBorders>
-            <w:tcMar>
-              <w:top w:w="40" w:type="dxa"/>
-              <w:left w:w="80" w:type="dxa"/>
-              <w:bottom w:w="40" w:type="dxa"/>
-              <w:right w:w="80" w:type="dxa"/>
-            </w:tcMar>
-          </w:tcPr>
-          <w:p>
-            <w:pPr>
-              <w:jc w:val="center"/>
-            </w:pPr>
-            <w:r>
-              <w:rPr>
-                <w:sz w:val="18"/>
-                <w:szCs w:val="18"/>
-              </w:rPr>
-              <w:t>0.000</w:t>
-            </w:r>
-          </w:p>
-        </w:tc>
-      </w:tr>
-      <w:tr>
-        <w:tc>
-          <w:tcPr>
-            <w:tcW w:w="0" w:type="auto"/>
-            <w:tcBorders>
-              <w:top w:val="single" w:sz="2" w:space="0" w:color="999999"/>
-              <w:left w:val="single" w:sz="2" w:space="0" w:color="999999"/>
-              <w:bottom w:val="single" w:sz="2" w:space="0" w:color="999999"/>
-              <w:right w:val="single" w:sz="2" w:space="0" w:color="999999"/>
-            </w:tcBorders>
-            <w:tcMar>
-              <w:top w:w="40" w:type="dxa"/>
-              <w:left w:w="80" w:type="dxa"/>
-              <w:bottom w:w="40" w:type="dxa"/>
-              <w:right w:w="80" w:type="dxa"/>
-            </w:tcMar>
-          </w:tcPr>
-          <w:p>
-            <w:pPr>
-              <w:jc w:val="center"/>
-            </w:pPr>
-            <w:r>
-              <w:rPr>
-                <w:sz w:val="18"/>
-                <w:szCs w:val="18"/>
-              </w:rPr>
-              <w:t>Fe₂O₃</w:t>
-            </w:r>
-          </w:p>
-        </w:tc>
-        <w:tc>
-          <w:tcPr>
-            <w:tcW w:w="0" w:type="auto"/>
-            <w:tcBorders>
-              <w:top w:val="single" w:sz="2" w:space="0" w:color="999999"/>
-              <w:left w:val="single" w:sz="2" w:space="0" w:color="999999"/>
-              <w:bottom w:val="single" w:sz="2" w:space="0" w:color="999999"/>
-              <w:right w:val="single" w:sz="2" w:space="0" w:color="999999"/>
-            </w:tcBorders>
-            <w:tcMar>
-              <w:top w:w="40" w:type="dxa"/>
-              <w:left w:w="80" w:type="dxa"/>
-              <w:bottom w:w="40" w:type="dxa"/>
-              <w:right w:w="80" w:type="dxa"/>
-            </w:tcMar>
-          </w:tcPr>
-          <w:p>
-            <w:pPr>
-              <w:jc w:val="center"/>
-            </w:pPr>
-            <w:r>
-              <w:rPr>
-                <w:sz w:val="18"/>
-                <w:szCs w:val="18"/>
-              </w:rPr>
-              <w:t>18</w:t>
-            </w:r>
-          </w:p>
-        </w:tc>
-        <w:tc>
-          <w:tcPr>
-            <w:tcW w:w="0" w:type="auto"/>
-            <w:tcBorders>
-              <w:top w:val="single" w:sz="2" w:space="0" w:color="999999"/>
-              <w:left w:val="single" w:sz="2" w:space="0" w:color="999999"/>
-              <w:bottom w:val="single" w:sz="2" w:space="0" w:color="999999"/>
-              <w:right w:val="single" w:sz="2" w:space="0" w:color="999999"/>
-            </w:tcBorders>
-            <w:tcMar>
-              <w:top w:w="40" w:type="dxa"/>
-              <w:left w:w="80" w:type="dxa"/>
-              <w:bottom w:w="40" w:type="dxa"/>
-              <w:right w:w="80" w:type="dxa"/>
-            </w:tcMar>
-          </w:tcPr>
-          <w:p>
-            <w:pPr>
-              <w:jc w:val="center"/>
-            </w:pPr>
-            <w:r>
-              <w:rPr>
-                <w:sz w:val="18"/>
-                <w:szCs w:val="18"/>
-              </w:rPr>
-              <w:t>0</w:t>
-            </w:r>
-          </w:p>
-        </w:tc>
-        <w:tc>
-          <w:tcPr>
-            <w:tcW w:w="0" w:type="auto"/>
-            <w:tcBorders>
-              <w:top w:val="single" w:sz="2" w:space="0" w:color="999999"/>
-              <w:left w:val="single" w:sz="2" w:space="0" w:color="999999"/>
-              <w:bottom w:val="single" w:sz="2" w:space="0" w:color="999999"/>
-              <w:right w:val="single" w:sz="2" w:space="0" w:color="999999"/>
-            </w:tcBorders>
-            <w:tcMar>
-              <w:top w:w="40" w:type="dxa"/>
-              <w:left w:w="80" w:type="dxa"/>
-              <w:bottom w:w="40" w:type="dxa"/>
-              <w:right w:w="80" w:type="dxa"/>
-            </w:tcMar>
-          </w:tcPr>
-          <w:p>
-            <w:pPr>
-              <w:jc w:val="center"/>
-            </w:pPr>
-            <w:r>
-              <w:rPr>
-                <w:sz w:val="18"/>
-                <w:szCs w:val="18"/>
-              </w:rPr>
-              <w:t>18</w:t>
-            </w:r>
-          </w:p>
-        </w:tc>
-        <w:tc>
-          <w:tcPr>
-            <w:tcW w:w="0" w:type="auto"/>
-            <w:tcBorders>
-              <w:top w:val="single" w:sz="2" w:space="0" w:color="999999"/>
-              <w:left w:val="single" w:sz="2" w:space="0" w:color="999999"/>
-              <w:bottom w:val="single" w:sz="2" w:space="0" w:color="999999"/>
-              <w:right w:val="single" w:sz="2" w:space="0" w:color="999999"/>
-            </w:tcBorders>
-            <w:tcMar>
-              <w:top w:w="40" w:type="dxa"/>
-              <w:left w:w="80" w:type="dxa"/>
-              <w:bottom w:w="40" w:type="dxa"/>
-              <w:right w:w="80" w:type="dxa"/>
-            </w:tcMar>
-          </w:tcPr>
-          <w:p>
-            <w:pPr>
-              <w:jc w:val="center"/>
-            </w:pPr>
-            <w:r>
-              <w:rPr>
-                <w:sz w:val="18"/>
-                <w:szCs w:val="18"/>
-              </w:rPr>
-              <w:t>0.000</w:t>
-            </w:r>
-          </w:p>
-        </w:tc>
-      </w:tr>
-      <w:tr>
-        <w:tc>
-          <w:tcPr>
-            <w:tcW w:w="0" w:type="auto"/>
-            <w:tcBorders>
-              <w:top w:val="single" w:sz="2" w:space="0" w:color="999999"/>
-              <w:left w:val="single" w:sz="2" w:space="0" w:color="999999"/>
-              <w:bottom w:val="single" w:sz="2" w:space="0" w:color="999999"/>
-              <w:right w:val="single" w:sz="2" w:space="0" w:color="999999"/>
-            </w:tcBorders>
-            <w:tcMar>
-              <w:top w:w="40" w:type="dxa"/>
-              <w:left w:w="80" w:type="dxa"/>
-              <w:bottom w:w="40" w:type="dxa"/>
-              <w:right w:w="80" w:type="dxa"/>
-            </w:tcMar>
-          </w:tcPr>
-          <w:p>
-            <w:pPr>
-              <w:jc w:val="center"/>
-            </w:pPr>
-            <w:r>
-              <w:rPr>
-                <w:sz w:val="18"/>
-                <w:szCs w:val="18"/>
-              </w:rPr>
-              <w:t>Total</w:t>
-            </w:r>
-          </w:p>
-        </w:tc>
-        <w:tc>
-          <w:tcPr>
-            <w:tcW w:w="0" w:type="auto"/>
-            <w:tcBorders>
-              <w:top w:val="single" w:sz="2" w:space="0" w:color="999999"/>
-              <w:left w:val="single" w:sz="2" w:space="0" w:color="999999"/>
-              <w:bottom w:val="single" w:sz="2" w:space="0" w:color="999999"/>
-              <w:right w:val="single" w:sz="2" w:space="0" w:color="999999"/>
-            </w:tcBorders>
-            <w:tcMar>
-              <w:top w:w="40" w:type="dxa"/>
-              <w:left w:w="80" w:type="dxa"/>
-              <w:bottom w:w="40" w:type="dxa"/>
-              <w:right w:w="80" w:type="dxa"/>
-            </w:tcMar>
-          </w:tcPr>
-          <w:p>
-            <w:pPr>
-              <w:jc w:val="center"/>
-            </w:pPr>
-            <w:r>
-              <w:rPr>
-                <w:sz w:val="18"/>
-                <w:szCs w:val="18"/>
-              </w:rPr>
-              <w:t>364</w:t>
-            </w:r>
-          </w:p>
-        </w:tc>
-        <w:tc>
-          <w:tcPr>
-            <w:tcW w:w="0" w:type="auto"/>
-            <w:tcBorders>
-              <w:top w:val="single" w:sz="2" w:space="0" w:color="999999"/>
-              <w:left w:val="single" w:sz="2" w:space="0" w:color="999999"/>
-              <w:bottom w:val="single" w:sz="2" w:space="0" w:color="999999"/>
-              <w:right w:val="single" w:sz="2" w:space="0" w:color="999999"/>
-            </w:tcBorders>
-            <w:tcMar>
-              <w:top w:w="40" w:type="dxa"/>
-              <w:left w:w="80" w:type="dxa"/>
-              <w:bottom w:w="40" w:type="dxa"/>
-              <w:right w:w="80" w:type="dxa"/>
-            </w:tcMar>
-          </w:tcPr>
-          <w:p>
-            <w:pPr>
-              <w:jc w:val="center"/>
-            </w:pPr>
-            <w:r>
-              <w:rPr>
-                <w:sz w:val="18"/>
-                <w:szCs w:val="18"/>
-              </w:rPr>
-              <w:t>68</w:t>
-            </w:r>
-          </w:p>
-        </w:tc>
-        <w:tc>
-          <w:tcPr>
-            <w:tcW w:w="0" w:type="auto"/>
-            <w:tcBorders>
-              <w:top w:val="single" w:sz="2" w:space="0" w:color="999999"/>
-              <w:left w:val="single" w:sz="2" w:space="0" w:color="999999"/>
-              <w:bottom w:val="single" w:sz="2" w:space="0" w:color="999999"/>
-              <w:right w:val="single" w:sz="2" w:space="0" w:color="999999"/>
-            </w:tcBorders>
-            <w:tcMar>
-              <w:top w:w="40" w:type="dxa"/>
-              <w:left w:w="80" w:type="dxa"/>
-              <w:bottom w:w="40" w:type="dxa"/>
-              <w:right w:w="80" w:type="dxa"/>
-            </w:tcMar>
-          </w:tcPr>
-          <w:p>
-            <w:pPr>
-              <w:jc w:val="center"/>
-            </w:pPr>
-            <w:r>
-              <w:rPr>
-                <w:sz w:val="18"/>
-                <w:szCs w:val="18"/>
-              </w:rPr>
-              <w:t>296</w:t>
-            </w:r>
-          </w:p>
-        </w:tc>
-        <w:tc>
-          <w:tcPr>
-            <w:tcW w:w="0" w:type="auto"/>
-            <w:tcBorders>
-              <w:top w:val="single" w:sz="2" w:space="0" w:color="999999"/>
-              <w:left w:val="single" w:sz="2" w:space="0" w:color="999999"/>
-              <w:bottom w:val="single" w:sz="2" w:space="0" w:color="999999"/>
-              <w:right w:val="single" w:sz="2" w:space="0" w:color="999999"/>
-            </w:tcBorders>
-            <w:tcMar>
-              <w:top w:w="40" w:type="dxa"/>
-              <w:left w:w="80" w:type="dxa"/>
-              <w:bottom w:w="40" w:type="dxa"/>
-              <w:right w:w="80" w:type="dxa"/>
-            </w:tcMar>
-          </w:tcPr>
-          <w:p>
-            <w:pPr>
-              <w:jc w:val="center"/>
-            </w:pPr>
-            <w:r>
-              <w:rPr>
-                <w:sz w:val="18"/>
-                <w:szCs w:val="18"/>
-              </w:rPr>
-              <w:t>0.187</w:t>
-            </w:r>
-          </w:p>
-        </w:tc>
-      </w:tr>
-    </w:tbl>
-    <w:p>
-      <w:pPr>
-        <w:spacing w:before="80" w:after="80"/>
-        <w:rPr>
-          <w:i/>
-          <w:iCs/>
-          <w:sz w:val="18"/>
-          <w:szCs w:val="18"/>
-        </w:rPr>
-      </w:pPr>
-      <w:r>
-        <w:rPr>
-          <w:i/>
-          <w:iCs/>
-          <w:sz w:val="18"/>
-          <w:szCs w:val="18"/>
-        </w:rPr>
-        <w:t xml:space="preserve">Cytotoxic instances are heavily concentrated in ZnO (60 of 68). Two oxides (Al₂O₃, Fe₂O₃) contain no cytotoxic instances, leaving their folds single-class and their fold MCC undefined.</w:t>
-      </w:r>
-    </w:p>
     <w:p>
       <w:pPr>
         <w:spacing w:before="80" w:after="80"/>
@@ -6447,7 +4595,7 @@
     <w:p/>
     <w:p>
       <w:pPr>
-        <w:spacing w:before="240" w:after="80"/>
+        <w:spacing w:before="240" w:after="80" w:line="360" w:lineRule="auto"/>
         <w:jc w:val="both"/>
         <w:rPr>
           <w:rFonts w:ascii="Times New Roman" w:hAnsi="Times New Roman" w:cs="Times New Roman"/>
@@ -6458,13 +4606,16 @@
           <w:rFonts w:ascii="Times New Roman" w:hAnsi="Times New Roman" w:cs="Times New Roman"/>
           <w:b/>
           <w:bCs/>
+          <w:sz w:val="24"/>
+          <w:szCs w:val="24"/>
         </w:rPr>
-        <w:lastRenderedPageBreak/>
-        <w:t xml:space="preserve">Table S6. </w:t>
+        <w:t xml:space="preserve">Table S4. </w:t>
       </w:r>
       <w:r>
         <w:rPr>
           <w:rFonts w:ascii="Times New Roman" w:hAnsi="Times New Roman" w:cs="Times New Roman"/>
+          <w:sz w:val="24"/>
+          <w:szCs w:val="24"/>
         </w:rPr>
         <w:t>Hyperparameter sensitivity. LOMO MCC (with 95% percentile-bootstrap CI) across a small grid of reasonable settings for the random forest, support vector machine, and multilayer perceptron.</w:t>
       </w:r>
@@ -6517,6 +4668,7 @@
             </w:pPr>
             <w:r>
               <w:rPr>
+                <w:rFonts w:ascii="Times New Roman" w:hAnsi="Times New Roman" w:cs="Times New Roman"/>
                 <w:b/>
                 <w:bCs/>
                 <w:sz w:val="18"/>
@@ -6549,6 +4701,7 @@
             </w:pPr>
             <w:r>
               <w:rPr>
+                <w:rFonts w:ascii="Times New Roman" w:hAnsi="Times New Roman" w:cs="Times New Roman"/>
                 <w:b/>
                 <w:bCs/>
                 <w:sz w:val="18"/>
@@ -6581,6 +4734,7 @@
             </w:pPr>
             <w:r>
               <w:rPr>
+                <w:rFonts w:ascii="Times New Roman" w:hAnsi="Times New Roman" w:cs="Times New Roman"/>
                 <w:b/>
                 <w:bCs/>
                 <w:sz w:val="18"/>
@@ -6613,6 +4767,7 @@
             </w:pPr>
             <w:r>
               <w:rPr>
+                <w:rFonts w:ascii="Times New Roman" w:hAnsi="Times New Roman" w:cs="Times New Roman"/>
                 <w:b/>
                 <w:bCs/>
                 <w:sz w:val="18"/>
@@ -6645,6 +4800,7 @@
             </w:pPr>
             <w:r>
               <w:rPr>
+                <w:rFonts w:ascii="Times New Roman" w:hAnsi="Times New Roman" w:cs="Times New Roman"/>
                 <w:b/>
                 <w:bCs/>
                 <w:sz w:val="18"/>
@@ -6678,6 +4834,7 @@
             </w:pPr>
             <w:r>
               <w:rPr>
+                <w:rFonts w:ascii="Times New Roman" w:hAnsi="Times New Roman" w:cs="Times New Roman"/>
                 <w:sz w:val="18"/>
                 <w:szCs w:val="18"/>
               </w:rPr>
@@ -6707,6 +4864,7 @@
             </w:pPr>
             <w:r>
               <w:rPr>
+                <w:rFonts w:ascii="Times New Roman" w:hAnsi="Times New Roman" w:cs="Times New Roman"/>
                 <w:sz w:val="18"/>
                 <w:szCs w:val="18"/>
               </w:rPr>
@@ -6736,6 +4894,7 @@
             </w:pPr>
             <w:r>
               <w:rPr>
+                <w:rFonts w:ascii="Times New Roman" w:hAnsi="Times New Roman" w:cs="Times New Roman"/>
                 <w:sz w:val="18"/>
                 <w:szCs w:val="18"/>
               </w:rPr>
@@ -6765,6 +4924,7 @@
             </w:pPr>
             <w:r>
               <w:rPr>
+                <w:rFonts w:ascii="Times New Roman" w:hAnsi="Times New Roman" w:cs="Times New Roman"/>
                 <w:sz w:val="18"/>
                 <w:szCs w:val="18"/>
               </w:rPr>
@@ -6794,6 +4954,7 @@
             </w:pPr>
             <w:r>
               <w:rPr>
+                <w:rFonts w:ascii="Times New Roman" w:hAnsi="Times New Roman" w:cs="Times New Roman"/>
                 <w:sz w:val="18"/>
                 <w:szCs w:val="18"/>
               </w:rPr>
@@ -6825,6 +4986,7 @@
             </w:pPr>
             <w:r>
               <w:rPr>
+                <w:rFonts w:ascii="Times New Roman" w:hAnsi="Times New Roman" w:cs="Times New Roman"/>
                 <w:sz w:val="18"/>
                 <w:szCs w:val="18"/>
               </w:rPr>
@@ -6854,6 +5016,7 @@
             </w:pPr>
             <w:r>
               <w:rPr>
+                <w:rFonts w:ascii="Times New Roman" w:hAnsi="Times New Roman" w:cs="Times New Roman"/>
                 <w:sz w:val="18"/>
                 <w:szCs w:val="18"/>
               </w:rPr>
@@ -6883,6 +5046,7 @@
             </w:pPr>
             <w:r>
               <w:rPr>
+                <w:rFonts w:ascii="Times New Roman" w:hAnsi="Times New Roman" w:cs="Times New Roman"/>
                 <w:sz w:val="18"/>
                 <w:szCs w:val="18"/>
               </w:rPr>
@@ -6912,6 +5076,7 @@
             </w:pPr>
             <w:r>
               <w:rPr>
+                <w:rFonts w:ascii="Times New Roman" w:hAnsi="Times New Roman" w:cs="Times New Roman"/>
                 <w:sz w:val="18"/>
                 <w:szCs w:val="18"/>
               </w:rPr>
@@ -6941,6 +5106,7 @@
             </w:pPr>
             <w:r>
               <w:rPr>
+                <w:rFonts w:ascii="Times New Roman" w:hAnsi="Times New Roman" w:cs="Times New Roman"/>
                 <w:sz w:val="18"/>
                 <w:szCs w:val="18"/>
               </w:rPr>
@@ -6972,6 +5138,7 @@
             </w:pPr>
             <w:r>
               <w:rPr>
+                <w:rFonts w:ascii="Times New Roman" w:hAnsi="Times New Roman" w:cs="Times New Roman"/>
                 <w:sz w:val="18"/>
                 <w:szCs w:val="18"/>
               </w:rPr>
@@ -7001,6 +5168,7 @@
             </w:pPr>
             <w:r>
               <w:rPr>
+                <w:rFonts w:ascii="Times New Roman" w:hAnsi="Times New Roman" w:cs="Times New Roman"/>
                 <w:sz w:val="18"/>
                 <w:szCs w:val="18"/>
               </w:rPr>
@@ -7030,6 +5198,7 @@
             </w:pPr>
             <w:r>
               <w:rPr>
+                <w:rFonts w:ascii="Times New Roman" w:hAnsi="Times New Roman" w:cs="Times New Roman"/>
                 <w:sz w:val="18"/>
                 <w:szCs w:val="18"/>
               </w:rPr>
@@ -7059,6 +5228,7 @@
             </w:pPr>
             <w:r>
               <w:rPr>
+                <w:rFonts w:ascii="Times New Roman" w:hAnsi="Times New Roman" w:cs="Times New Roman"/>
                 <w:sz w:val="18"/>
                 <w:szCs w:val="18"/>
               </w:rPr>
@@ -7088,6 +5258,7 @@
             </w:pPr>
             <w:r>
               <w:rPr>
+                <w:rFonts w:ascii="Times New Roman" w:hAnsi="Times New Roman" w:cs="Times New Roman"/>
                 <w:sz w:val="18"/>
                 <w:szCs w:val="18"/>
               </w:rPr>
@@ -7119,6 +5290,7 @@
             </w:pPr>
             <w:r>
               <w:rPr>
+                <w:rFonts w:ascii="Times New Roman" w:hAnsi="Times New Roman" w:cs="Times New Roman"/>
                 <w:sz w:val="18"/>
                 <w:szCs w:val="18"/>
               </w:rPr>
@@ -7148,6 +5320,7 @@
             </w:pPr>
             <w:r>
               <w:rPr>
+                <w:rFonts w:ascii="Times New Roman" w:hAnsi="Times New Roman" w:cs="Times New Roman"/>
                 <w:sz w:val="18"/>
                 <w:szCs w:val="18"/>
               </w:rPr>
@@ -7177,6 +5350,7 @@
             </w:pPr>
             <w:r>
               <w:rPr>
+                <w:rFonts w:ascii="Times New Roman" w:hAnsi="Times New Roman" w:cs="Times New Roman"/>
                 <w:sz w:val="18"/>
                 <w:szCs w:val="18"/>
               </w:rPr>
@@ -7206,6 +5380,7 @@
             </w:pPr>
             <w:r>
               <w:rPr>
+                <w:rFonts w:ascii="Times New Roman" w:hAnsi="Times New Roman" w:cs="Times New Roman"/>
                 <w:sz w:val="18"/>
                 <w:szCs w:val="18"/>
               </w:rPr>
@@ -7235,6 +5410,7 @@
             </w:pPr>
             <w:r>
               <w:rPr>
+                <w:rFonts w:ascii="Times New Roman" w:hAnsi="Times New Roman" w:cs="Times New Roman"/>
                 <w:sz w:val="18"/>
                 <w:szCs w:val="18"/>
               </w:rPr>
@@ -7266,6 +5442,7 @@
             </w:pPr>
             <w:r>
               <w:rPr>
+                <w:rFonts w:ascii="Times New Roman" w:hAnsi="Times New Roman" w:cs="Times New Roman"/>
                 <w:sz w:val="18"/>
                 <w:szCs w:val="18"/>
               </w:rPr>
@@ -7295,6 +5472,7 @@
             </w:pPr>
             <w:r>
               <w:rPr>
+                <w:rFonts w:ascii="Times New Roman" w:hAnsi="Times New Roman" w:cs="Times New Roman"/>
                 <w:sz w:val="18"/>
                 <w:szCs w:val="18"/>
               </w:rPr>
@@ -7324,6 +5502,7 @@
             </w:pPr>
             <w:r>
               <w:rPr>
+                <w:rFonts w:ascii="Times New Roman" w:hAnsi="Times New Roman" w:cs="Times New Roman"/>
                 <w:sz w:val="18"/>
                 <w:szCs w:val="18"/>
               </w:rPr>
@@ -7353,6 +5532,7 @@
             </w:pPr>
             <w:r>
               <w:rPr>
+                <w:rFonts w:ascii="Times New Roman" w:hAnsi="Times New Roman" w:cs="Times New Roman"/>
                 <w:sz w:val="18"/>
                 <w:szCs w:val="18"/>
               </w:rPr>
@@ -7382,6 +5562,7 @@
             </w:pPr>
             <w:r>
               <w:rPr>
+                <w:rFonts w:ascii="Times New Roman" w:hAnsi="Times New Roman" w:cs="Times New Roman"/>
                 <w:sz w:val="18"/>
                 <w:szCs w:val="18"/>
               </w:rPr>
@@ -7413,6 +5594,7 @@
             </w:pPr>
             <w:r>
               <w:rPr>
+                <w:rFonts w:ascii="Times New Roman" w:hAnsi="Times New Roman" w:cs="Times New Roman"/>
                 <w:sz w:val="18"/>
                 <w:szCs w:val="18"/>
               </w:rPr>
@@ -7442,6 +5624,7 @@
             </w:pPr>
             <w:r>
               <w:rPr>
+                <w:rFonts w:ascii="Times New Roman" w:hAnsi="Times New Roman" w:cs="Times New Roman"/>
                 <w:sz w:val="18"/>
                 <w:szCs w:val="18"/>
               </w:rPr>
@@ -7471,6 +5654,7 @@
             </w:pPr>
             <w:r>
               <w:rPr>
+                <w:rFonts w:ascii="Times New Roman" w:hAnsi="Times New Roman" w:cs="Times New Roman"/>
                 <w:sz w:val="18"/>
                 <w:szCs w:val="18"/>
               </w:rPr>
@@ -7500,6 +5684,7 @@
             </w:pPr>
             <w:r>
               <w:rPr>
+                <w:rFonts w:ascii="Times New Roman" w:hAnsi="Times New Roman" w:cs="Times New Roman"/>
                 <w:sz w:val="18"/>
                 <w:szCs w:val="18"/>
               </w:rPr>
@@ -7529,6 +5714,7 @@
             </w:pPr>
             <w:r>
               <w:rPr>
+                <w:rFonts w:ascii="Times New Roman" w:hAnsi="Times New Roman" w:cs="Times New Roman"/>
                 <w:sz w:val="18"/>
                 <w:szCs w:val="18"/>
               </w:rPr>
@@ -7560,6 +5746,7 @@
             </w:pPr>
             <w:r>
               <w:rPr>
+                <w:rFonts w:ascii="Times New Roman" w:hAnsi="Times New Roman" w:cs="Times New Roman"/>
                 <w:sz w:val="18"/>
                 <w:szCs w:val="18"/>
               </w:rPr>
@@ -7589,6 +5776,7 @@
             </w:pPr>
             <w:r>
               <w:rPr>
+                <w:rFonts w:ascii="Times New Roman" w:hAnsi="Times New Roman" w:cs="Times New Roman"/>
                 <w:sz w:val="18"/>
                 <w:szCs w:val="18"/>
               </w:rPr>
@@ -7618,6 +5806,7 @@
             </w:pPr>
             <w:r>
               <w:rPr>
+                <w:rFonts w:ascii="Times New Roman" w:hAnsi="Times New Roman" w:cs="Times New Roman"/>
                 <w:sz w:val="18"/>
                 <w:szCs w:val="18"/>
               </w:rPr>
@@ -7647,6 +5836,7 @@
             </w:pPr>
             <w:r>
               <w:rPr>
+                <w:rFonts w:ascii="Times New Roman" w:hAnsi="Times New Roman" w:cs="Times New Roman"/>
                 <w:sz w:val="18"/>
                 <w:szCs w:val="18"/>
               </w:rPr>
@@ -7676,6 +5866,7 @@
             </w:pPr>
             <w:r>
               <w:rPr>
+                <w:rFonts w:ascii="Times New Roman" w:hAnsi="Times New Roman" w:cs="Times New Roman"/>
                 <w:sz w:val="18"/>
                 <w:szCs w:val="18"/>
               </w:rPr>
@@ -7707,6 +5898,7 @@
             </w:pPr>
             <w:r>
               <w:rPr>
+                <w:rFonts w:ascii="Times New Roman" w:hAnsi="Times New Roman" w:cs="Times New Roman"/>
                 <w:sz w:val="18"/>
                 <w:szCs w:val="18"/>
               </w:rPr>
@@ -7736,6 +5928,7 @@
             </w:pPr>
             <w:r>
               <w:rPr>
+                <w:rFonts w:ascii="Times New Roman" w:hAnsi="Times New Roman" w:cs="Times New Roman"/>
                 <w:sz w:val="18"/>
                 <w:szCs w:val="18"/>
               </w:rPr>
@@ -7765,6 +5958,7 @@
             </w:pPr>
             <w:r>
               <w:rPr>
+                <w:rFonts w:ascii="Times New Roman" w:hAnsi="Times New Roman" w:cs="Times New Roman"/>
                 <w:sz w:val="18"/>
                 <w:szCs w:val="18"/>
               </w:rPr>
@@ -7794,6 +5988,7 @@
             </w:pPr>
             <w:r>
               <w:rPr>
+                <w:rFonts w:ascii="Times New Roman" w:hAnsi="Times New Roman" w:cs="Times New Roman"/>
                 <w:sz w:val="18"/>
                 <w:szCs w:val="18"/>
               </w:rPr>
@@ -7823,6 +6018,7 @@
             </w:pPr>
             <w:r>
               <w:rPr>
+                <w:rFonts w:ascii="Times New Roman" w:hAnsi="Times New Roman" w:cs="Times New Roman"/>
                 <w:sz w:val="18"/>
                 <w:szCs w:val="18"/>
               </w:rPr>
@@ -7854,6 +6050,7 @@
             </w:pPr>
             <w:r>
               <w:rPr>
+                <w:rFonts w:ascii="Times New Roman" w:hAnsi="Times New Roman" w:cs="Times New Roman"/>
                 <w:sz w:val="18"/>
                 <w:szCs w:val="18"/>
               </w:rPr>
@@ -7883,6 +6080,7 @@
             </w:pPr>
             <w:r>
               <w:rPr>
+                <w:rFonts w:ascii="Times New Roman" w:hAnsi="Times New Roman" w:cs="Times New Roman"/>
                 <w:sz w:val="18"/>
                 <w:szCs w:val="18"/>
               </w:rPr>
@@ -7912,6 +6110,7 @@
             </w:pPr>
             <w:r>
               <w:rPr>
+                <w:rFonts w:ascii="Times New Roman" w:hAnsi="Times New Roman" w:cs="Times New Roman"/>
                 <w:sz w:val="18"/>
                 <w:szCs w:val="18"/>
               </w:rPr>
@@ -7941,6 +6140,7 @@
             </w:pPr>
             <w:r>
               <w:rPr>
+                <w:rFonts w:ascii="Times New Roman" w:hAnsi="Times New Roman" w:cs="Times New Roman"/>
                 <w:sz w:val="18"/>
                 <w:szCs w:val="18"/>
               </w:rPr>
@@ -7970,6 +6170,7 @@
             </w:pPr>
             <w:r>
               <w:rPr>
+                <w:rFonts w:ascii="Times New Roman" w:hAnsi="Times New Roman" w:cs="Times New Roman"/>
                 <w:sz w:val="18"/>
                 <w:szCs w:val="18"/>
               </w:rPr>
@@ -8001,6 +6202,7 @@
             </w:pPr>
             <w:r>
               <w:rPr>
+                <w:rFonts w:ascii="Times New Roman" w:hAnsi="Times New Roman" w:cs="Times New Roman"/>
                 <w:sz w:val="18"/>
                 <w:szCs w:val="18"/>
               </w:rPr>
@@ -8030,6 +6232,7 @@
             </w:pPr>
             <w:r>
               <w:rPr>
+                <w:rFonts w:ascii="Times New Roman" w:hAnsi="Times New Roman" w:cs="Times New Roman"/>
                 <w:sz w:val="18"/>
                 <w:szCs w:val="18"/>
               </w:rPr>
@@ -8059,6 +6262,7 @@
             </w:pPr>
             <w:r>
               <w:rPr>
+                <w:rFonts w:ascii="Times New Roman" w:hAnsi="Times New Roman" w:cs="Times New Roman"/>
                 <w:sz w:val="18"/>
                 <w:szCs w:val="18"/>
               </w:rPr>
@@ -8088,6 +6292,7 @@
             </w:pPr>
             <w:r>
               <w:rPr>
+                <w:rFonts w:ascii="Times New Roman" w:hAnsi="Times New Roman" w:cs="Times New Roman"/>
                 <w:sz w:val="18"/>
                 <w:szCs w:val="18"/>
               </w:rPr>
@@ -8117,6 +6322,7 @@
             </w:pPr>
             <w:r>
               <w:rPr>
+                <w:rFonts w:ascii="Times New Roman" w:hAnsi="Times New Roman" w:cs="Times New Roman"/>
                 <w:sz w:val="18"/>
                 <w:szCs w:val="18"/>
               </w:rPr>
@@ -8148,6 +6354,7 @@
             </w:pPr>
             <w:r>
               <w:rPr>
+                <w:rFonts w:ascii="Times New Roman" w:hAnsi="Times New Roman" w:cs="Times New Roman"/>
                 <w:sz w:val="18"/>
                 <w:szCs w:val="18"/>
               </w:rPr>
@@ -8177,6 +6384,7 @@
             </w:pPr>
             <w:r>
               <w:rPr>
+                <w:rFonts w:ascii="Times New Roman" w:hAnsi="Times New Roman" w:cs="Times New Roman"/>
                 <w:sz w:val="18"/>
                 <w:szCs w:val="18"/>
               </w:rPr>
@@ -8206,6 +6414,7 @@
             </w:pPr>
             <w:r>
               <w:rPr>
+                <w:rFonts w:ascii="Times New Roman" w:hAnsi="Times New Roman" w:cs="Times New Roman"/>
                 <w:sz w:val="18"/>
                 <w:szCs w:val="18"/>
               </w:rPr>
@@ -8235,6 +6444,7 @@
             </w:pPr>
             <w:r>
               <w:rPr>
+                <w:rFonts w:ascii="Times New Roman" w:hAnsi="Times New Roman" w:cs="Times New Roman"/>
                 <w:sz w:val="18"/>
                 <w:szCs w:val="18"/>
               </w:rPr>
@@ -8264,6 +6474,7 @@
             </w:pPr>
             <w:r>
               <w:rPr>
+                <w:rFonts w:ascii="Times New Roman" w:hAnsi="Times New Roman" w:cs="Times New Roman"/>
                 <w:sz w:val="18"/>
                 <w:szCs w:val="18"/>
               </w:rPr>
@@ -8295,6 +6506,7 @@
             </w:pPr>
             <w:r>
               <w:rPr>
+                <w:rFonts w:ascii="Times New Roman" w:hAnsi="Times New Roman" w:cs="Times New Roman"/>
                 <w:sz w:val="18"/>
                 <w:szCs w:val="18"/>
               </w:rPr>
@@ -8324,6 +6536,7 @@
             </w:pPr>
             <w:r>
               <w:rPr>
+                <w:rFonts w:ascii="Times New Roman" w:hAnsi="Times New Roman" w:cs="Times New Roman"/>
                 <w:sz w:val="18"/>
                 <w:szCs w:val="18"/>
               </w:rPr>
@@ -8353,6 +6566,7 @@
             </w:pPr>
             <w:r>
               <w:rPr>
+                <w:rFonts w:ascii="Times New Roman" w:hAnsi="Times New Roman" w:cs="Times New Roman"/>
                 <w:sz w:val="18"/>
                 <w:szCs w:val="18"/>
               </w:rPr>
@@ -8382,6 +6596,7 @@
             </w:pPr>
             <w:r>
               <w:rPr>
+                <w:rFonts w:ascii="Times New Roman" w:hAnsi="Times New Roman" w:cs="Times New Roman"/>
                 <w:sz w:val="18"/>
                 <w:szCs w:val="18"/>
               </w:rPr>
@@ -8411,6 +6626,7 @@
             </w:pPr>
             <w:r>
               <w:rPr>
+                <w:rFonts w:ascii="Times New Roman" w:hAnsi="Times New Roman" w:cs="Times New Roman"/>
                 <w:sz w:val="18"/>
                 <w:szCs w:val="18"/>
               </w:rPr>
@@ -8442,6 +6658,7 @@
             </w:pPr>
             <w:r>
               <w:rPr>
+                <w:rFonts w:ascii="Times New Roman" w:hAnsi="Times New Roman" w:cs="Times New Roman"/>
                 <w:sz w:val="18"/>
                 <w:szCs w:val="18"/>
               </w:rPr>
@@ -8471,6 +6688,7 @@
             </w:pPr>
             <w:r>
               <w:rPr>
+                <w:rFonts w:ascii="Times New Roman" w:hAnsi="Times New Roman" w:cs="Times New Roman"/>
                 <w:sz w:val="18"/>
                 <w:szCs w:val="18"/>
               </w:rPr>
@@ -8500,6 +6718,7 @@
             </w:pPr>
             <w:r>
               <w:rPr>
+                <w:rFonts w:ascii="Times New Roman" w:hAnsi="Times New Roman" w:cs="Times New Roman"/>
                 <w:sz w:val="18"/>
                 <w:szCs w:val="18"/>
               </w:rPr>
@@ -8529,6 +6748,7 @@
             </w:pPr>
             <w:r>
               <w:rPr>
+                <w:rFonts w:ascii="Times New Roman" w:hAnsi="Times New Roman" w:cs="Times New Roman"/>
                 <w:sz w:val="18"/>
                 <w:szCs w:val="18"/>
               </w:rPr>
@@ -8558,6 +6778,7 @@
             </w:pPr>
             <w:r>
               <w:rPr>
+                <w:rFonts w:ascii="Times New Roman" w:hAnsi="Times New Roman" w:cs="Times New Roman"/>
                 <w:sz w:val="18"/>
                 <w:szCs w:val="18"/>
               </w:rPr>
@@ -8589,6 +6810,7 @@
             </w:pPr>
             <w:r>
               <w:rPr>
+                <w:rFonts w:ascii="Times New Roman" w:hAnsi="Times New Roman" w:cs="Times New Roman"/>
                 <w:sz w:val="18"/>
                 <w:szCs w:val="18"/>
               </w:rPr>
@@ -8618,6 +6840,7 @@
             </w:pPr>
             <w:r>
               <w:rPr>
+                <w:rFonts w:ascii="Times New Roman" w:hAnsi="Times New Roman" w:cs="Times New Roman"/>
                 <w:sz w:val="18"/>
                 <w:szCs w:val="18"/>
               </w:rPr>
@@ -8647,6 +6870,7 @@
             </w:pPr>
             <w:r>
               <w:rPr>
+                <w:rFonts w:ascii="Times New Roman" w:hAnsi="Times New Roman" w:cs="Times New Roman"/>
                 <w:sz w:val="18"/>
                 <w:szCs w:val="18"/>
               </w:rPr>
@@ -8676,6 +6900,7 @@
             </w:pPr>
             <w:r>
               <w:rPr>
+                <w:rFonts w:ascii="Times New Roman" w:hAnsi="Times New Roman" w:cs="Times New Roman"/>
                 <w:sz w:val="18"/>
                 <w:szCs w:val="18"/>
               </w:rPr>
@@ -8705,6 +6930,7 @@
             </w:pPr>
             <w:r>
               <w:rPr>
+                <w:rFonts w:ascii="Times New Roman" w:hAnsi="Times New Roman" w:cs="Times New Roman"/>
                 <w:sz w:val="18"/>
                 <w:szCs w:val="18"/>
               </w:rPr>
@@ -8736,6 +6962,7 @@
             </w:pPr>
             <w:r>
               <w:rPr>
+                <w:rFonts w:ascii="Times New Roman" w:hAnsi="Times New Roman" w:cs="Times New Roman"/>
                 <w:sz w:val="18"/>
                 <w:szCs w:val="18"/>
               </w:rPr>
@@ -8765,6 +6992,7 @@
             </w:pPr>
             <w:r>
               <w:rPr>
+                <w:rFonts w:ascii="Times New Roman" w:hAnsi="Times New Roman" w:cs="Times New Roman"/>
                 <w:sz w:val="18"/>
                 <w:szCs w:val="18"/>
               </w:rPr>
@@ -8794,6 +7022,7 @@
             </w:pPr>
             <w:r>
               <w:rPr>
+                <w:rFonts w:ascii="Times New Roman" w:hAnsi="Times New Roman" w:cs="Times New Roman"/>
                 <w:sz w:val="18"/>
                 <w:szCs w:val="18"/>
               </w:rPr>
@@ -8823,6 +7052,7 @@
             </w:pPr>
             <w:r>
               <w:rPr>
+                <w:rFonts w:ascii="Times New Roman" w:hAnsi="Times New Roman" w:cs="Times New Roman"/>
                 <w:sz w:val="18"/>
                 <w:szCs w:val="18"/>
               </w:rPr>
@@ -8852,6 +7082,7 @@
             </w:pPr>
             <w:r>
               <w:rPr>
+                <w:rFonts w:ascii="Times New Roman" w:hAnsi="Times New Roman" w:cs="Times New Roman"/>
                 <w:sz w:val="18"/>
                 <w:szCs w:val="18"/>
               </w:rPr>
@@ -8867,18 +7098,19 @@
       </w:pPr>
       <w:r>
         <w:rPr>
+          <w:rFonts w:ascii="Times New Roman" w:hAnsi="Times New Roman" w:cs="Times New Roman"/>
           <w:i/>
           <w:iCs/>
           <w:sz w:val="18"/>
           <w:szCs w:val="18"/>
         </w:rPr>
-        <w:t>Random forest and SVM are at or below chance across all settings. The multilayer perceptron is above chance with an interval excluding zero in every setting (MCC +0.166 to +0.277). No configuration of any model reaches the dose-threshold baseline of 0.410. This is a descriptive robustness check, not a model-selection procedure; nested material-level tuning would be required to select hyperparameters without leakage.</w:t>
+        <w:t>Across the tested hyperparameter settings, random-forest and support-vector-machine pooled LOMO MCC values remained non-positive, whereas multilayer-perceptron MCC values remained positive (+0.166 to +0.277). No tested configuration reached the dose-threshold comparator of 0.410. This is a descriptive sensitivity analysis, not a model-selection procedure; the highest tested MLP value therefore does not replace the prespecified primary MLP result of 0.166.</w:t>
       </w:r>
     </w:p>
     <w:p/>
     <w:p>
       <w:pPr>
-        <w:spacing w:before="240" w:after="80"/>
+        <w:spacing w:before="240" w:after="80" w:line="360" w:lineRule="auto"/>
         <w:jc w:val="both"/>
         <w:rPr>
           <w:rFonts w:ascii="Times New Roman" w:hAnsi="Times New Roman" w:cs="Times New Roman"/>
@@ -8889,12 +7121,16 @@
           <w:rFonts w:ascii="Times New Roman" w:hAnsi="Times New Roman" w:cs="Times New Roman"/>
           <w:b/>
           <w:bCs/>
+          <w:sz w:val="24"/>
+          <w:szCs w:val="24"/>
         </w:rPr>
-        <w:t xml:space="preserve">Table S7. </w:t>
+        <w:t xml:space="preserve">Table S5. </w:t>
       </w:r>
       <w:r>
         <w:rPr>
           <w:rFonts w:ascii="Times New Roman" w:hAnsi="Times New Roman" w:cs="Times New Roman"/>
+          <w:sz w:val="24"/>
+          <w:szCs w:val="24"/>
         </w:rPr>
         <w:t xml:space="preserve">Permutation test results. Observed leave-one-oxide-out (LOMO) MCC against the label-permutation null distribution (1,000 permutations) for the two models selected for permutation testing: XGBoost (a representative high-capacity model whose point estimate sat below zero) and the multilayer perceptron (the only model with an interval above zero). Underlies Figures S1a and S1b.</w:t>
       </w:r>
@@ -8948,6 +7184,7 @@
             </w:pPr>
             <w:r>
               <w:rPr>
+                <w:rFonts w:ascii="Times New Roman" w:hAnsi="Times New Roman" w:cs="Times New Roman"/>
                 <w:b/>
                 <w:bCs/>
                 <w:sz w:val="18"/>
@@ -8980,6 +7217,7 @@
             </w:pPr>
             <w:r>
               <w:rPr>
+                <w:rFonts w:ascii="Times New Roman" w:hAnsi="Times New Roman" w:cs="Times New Roman"/>
                 <w:b/>
                 <w:bCs/>
                 <w:sz w:val="18"/>
@@ -9012,6 +7250,7 @@
             </w:pPr>
             <w:r>
               <w:rPr>
+                <w:rFonts w:ascii="Times New Roman" w:hAnsi="Times New Roman" w:cs="Times New Roman"/>
                 <w:b/>
                 <w:bCs/>
                 <w:sz w:val="18"/>
@@ -9044,6 +7283,7 @@
             </w:pPr>
             <w:r>
               <w:rPr>
+                <w:rFonts w:ascii="Times New Roman" w:hAnsi="Times New Roman" w:cs="Times New Roman"/>
                 <w:b/>
                 <w:bCs/>
                 <w:sz w:val="18"/>
@@ -9076,6 +7316,7 @@
             </w:pPr>
             <w:r>
               <w:rPr>
+                <w:rFonts w:ascii="Times New Roman" w:hAnsi="Times New Roman" w:cs="Times New Roman"/>
                 <w:b/>
                 <w:bCs/>
                 <w:sz w:val="18"/>
@@ -9108,6 +7349,7 @@
             </w:pPr>
             <w:r>
               <w:rPr>
+                <w:rFonts w:ascii="Times New Roman" w:hAnsi="Times New Roman" w:cs="Times New Roman"/>
                 <w:b/>
                 <w:bCs/>
                 <w:sz w:val="18"/>
@@ -9141,6 +7383,7 @@
             </w:pPr>
             <w:r>
               <w:rPr>
+                <w:rFonts w:ascii="Times New Roman" w:hAnsi="Times New Roman" w:cs="Times New Roman"/>
                 <w:sz w:val="18"/>
                 <w:szCs w:val="18"/>
               </w:rPr>
@@ -9170,6 +7413,7 @@
             </w:pPr>
             <w:r>
               <w:rPr>
+                <w:rFonts w:ascii="Times New Roman" w:hAnsi="Times New Roman" w:cs="Times New Roman"/>
                 <w:sz w:val="18"/>
                 <w:szCs w:val="18"/>
               </w:rPr>
@@ -9199,6 +7443,7 @@
             </w:pPr>
             <w:r>
               <w:rPr>
+                <w:rFonts w:ascii="Times New Roman" w:hAnsi="Times New Roman" w:cs="Times New Roman"/>
                 <w:sz w:val="18"/>
                 <w:szCs w:val="18"/>
               </w:rPr>
@@ -9228,6 +7473,7 @@
             </w:pPr>
             <w:r>
               <w:rPr>
+                <w:rFonts w:ascii="Times New Roman" w:hAnsi="Times New Roman" w:cs="Times New Roman"/>
                 <w:sz w:val="18"/>
                 <w:szCs w:val="18"/>
               </w:rPr>
@@ -9257,6 +7503,7 @@
             </w:pPr>
             <w:r>
               <w:rPr>
+                <w:rFonts w:ascii="Times New Roman" w:hAnsi="Times New Roman" w:cs="Times New Roman"/>
                 <w:sz w:val="18"/>
                 <w:szCs w:val="18"/>
               </w:rPr>
@@ -9286,6 +7533,7 @@
             </w:pPr>
             <w:r>
               <w:rPr>
+                <w:rFonts w:ascii="Times New Roman" w:hAnsi="Times New Roman" w:cs="Times New Roman"/>
                 <w:sz w:val="18"/>
                 <w:szCs w:val="18"/>
               </w:rPr>
@@ -9317,6 +7565,7 @@
             </w:pPr>
             <w:r>
               <w:rPr>
+                <w:rFonts w:ascii="Times New Roman" w:hAnsi="Times New Roman" w:cs="Times New Roman"/>
                 <w:sz w:val="18"/>
                 <w:szCs w:val="18"/>
               </w:rPr>
@@ -9346,6 +7595,7 @@
             </w:pPr>
             <w:r>
               <w:rPr>
+                <w:rFonts w:ascii="Times New Roman" w:hAnsi="Times New Roman" w:cs="Times New Roman"/>
                 <w:sz w:val="18"/>
                 <w:szCs w:val="18"/>
               </w:rPr>
@@ -9375,6 +7625,7 @@
             </w:pPr>
             <w:r>
               <w:rPr>
+                <w:rFonts w:ascii="Times New Roman" w:hAnsi="Times New Roman" w:cs="Times New Roman"/>
                 <w:sz w:val="18"/>
                 <w:szCs w:val="18"/>
               </w:rPr>
@@ -9404,6 +7655,7 @@
             </w:pPr>
             <w:r>
               <w:rPr>
+                <w:rFonts w:ascii="Times New Roman" w:hAnsi="Times New Roman" w:cs="Times New Roman"/>
                 <w:sz w:val="18"/>
                 <w:szCs w:val="18"/>
               </w:rPr>
@@ -9433,6 +7685,7 @@
             </w:pPr>
             <w:r>
               <w:rPr>
+                <w:rFonts w:ascii="Times New Roman" w:hAnsi="Times New Roman" w:cs="Times New Roman"/>
                 <w:sz w:val="18"/>
                 <w:szCs w:val="18"/>
               </w:rPr>
@@ -9462,6 +7715,7 @@
             </w:pPr>
             <w:r>
               <w:rPr>
+                <w:rFonts w:ascii="Times New Roman" w:hAnsi="Times New Roman" w:cs="Times New Roman"/>
                 <w:sz w:val="18"/>
                 <w:szCs w:val="18"/>
               </w:rPr>
@@ -9477,12 +7731,13 @@
       </w:pPr>
       <w:r>
         <w:rPr>
+          <w:rFonts w:ascii="Times New Roman" w:hAnsi="Times New Roman" w:cs="Times New Roman"/>
           <w:i/>
           <w:iCs/>
           <w:sz w:val="18"/>
           <w:szCs w:val="18"/>
         </w:rPr>
-        <w:t xml:space="preserve">The XGBoost observed score lies within its null 95% interval (p = 0.062), indistinguishable from chance. The multilayer perceptron observed score lies outside its null 95% interval (p = 0.004), distinguishable from chance. This is the statistical basis for treating the multilayer perceptron signal as real but narrow (see main text); it remains below the dose-threshold baseline of 0.410. As in the main text (Section 2.6), the permutation p-values and interval-based statements here are descriptive heuristics rather than formal tests of statistical significance.</w:t>
+        <w:t>The XGBoost observed score lay near the lower tail of its empirical permutation distribution (p = 0.062). The multilayer perceptron observed score was separated from its empirical permutation null under the specified global-label permutation analysis (p = 0.004), supporting a modest positive signal under that analysis. These permutation results should not be interpreted as exact material-level inferential tests because global label shuffling does not preserve oxide-specific outcome prevalence. The MLP result remains below the dose-threshold comparator in the main analysis.</w:t>
       </w:r>
     </w:p>
     <w:p/>
@@ -9497,7 +7752,7 @@
     <w:p/>
     <w:p>
       <w:pPr>
-        <w:spacing w:before="240" w:after="80"/>
+        <w:spacing w:before="240" w:after="80" w:line="360" w:lineRule="auto"/>
         <w:jc w:val="both"/>
         <w:rPr>
           <w:rFonts w:ascii="Times New Roman" w:hAnsi="Times New Roman" w:cs="Times New Roman"/>
@@ -9508,13 +7763,16 @@
           <w:rFonts w:ascii="Times New Roman" w:hAnsi="Times New Roman" w:cs="Times New Roman"/>
           <w:b/>
           <w:bCs/>
+          <w:sz w:val="24"/>
+          <w:szCs w:val="24"/>
         </w:rPr>
-        <w:lastRenderedPageBreak/>
-        <w:t xml:space="preserve">Table S8. </w:t>
+        <w:t xml:space="preserve">Table S6. </w:t>
       </w:r>
       <w:r>
         <w:rPr>
           <w:rFonts w:ascii="Times New Roman" w:hAnsi="Times New Roman" w:cs="Times New Roman"/>
+          <w:sz w:val="24"/>
+          <w:szCs w:val="24"/>
         </w:rPr>
         <w:t>Software environment. Python and package versions used for all analyses. A fixed random seed (42) was used for the primary analysis, with eight seeds {0, 1, 2, 3, 7, 13, 42, 99} for the stability assessment.</w:t>
       </w:r>
@@ -9564,6 +7822,7 @@
             </w:pPr>
             <w:r>
               <w:rPr>
+                <w:rFonts w:ascii="Times New Roman" w:hAnsi="Times New Roman" w:cs="Times New Roman"/>
                 <w:b/>
                 <w:bCs/>
                 <w:sz w:val="18"/>
@@ -9596,6 +7855,7 @@
             </w:pPr>
             <w:r>
               <w:rPr>
+                <w:rFonts w:ascii="Times New Roman" w:hAnsi="Times New Roman" w:cs="Times New Roman"/>
                 <w:b/>
                 <w:bCs/>
                 <w:sz w:val="18"/>
@@ -9629,6 +7889,7 @@
             </w:pPr>
             <w:r>
               <w:rPr>
+                <w:rFonts w:ascii="Times New Roman" w:hAnsi="Times New Roman" w:cs="Times New Roman"/>
                 <w:sz w:val="18"/>
                 <w:szCs w:val="18"/>
               </w:rPr>
@@ -9658,6 +7919,7 @@
             </w:pPr>
             <w:r>
               <w:rPr>
+                <w:rFonts w:ascii="Times New Roman" w:hAnsi="Times New Roman" w:cs="Times New Roman"/>
                 <w:sz w:val="18"/>
                 <w:szCs w:val="18"/>
               </w:rPr>
@@ -9689,6 +7951,7 @@
             </w:pPr>
             <w:r>
               <w:rPr>
+                <w:rFonts w:ascii="Times New Roman" w:hAnsi="Times New Roman" w:cs="Times New Roman"/>
                 <w:sz w:val="18"/>
                 <w:szCs w:val="18"/>
               </w:rPr>
@@ -9718,6 +7981,7 @@
             </w:pPr>
             <w:r>
               <w:rPr>
+                <w:rFonts w:ascii="Times New Roman" w:hAnsi="Times New Roman" w:cs="Times New Roman"/>
                 <w:sz w:val="18"/>
                 <w:szCs w:val="18"/>
               </w:rPr>
@@ -9749,6 +8013,7 @@
             </w:pPr>
             <w:r>
               <w:rPr>
+                <w:rFonts w:ascii="Times New Roman" w:hAnsi="Times New Roman" w:cs="Times New Roman"/>
                 <w:sz w:val="18"/>
                 <w:szCs w:val="18"/>
               </w:rPr>
@@ -9778,6 +8043,7 @@
             </w:pPr>
             <w:r>
               <w:rPr>
+                <w:rFonts w:ascii="Times New Roman" w:hAnsi="Times New Roman" w:cs="Times New Roman"/>
                 <w:sz w:val="18"/>
                 <w:szCs w:val="18"/>
               </w:rPr>
@@ -9809,6 +8075,7 @@
             </w:pPr>
             <w:r>
               <w:rPr>
+                <w:rFonts w:ascii="Times New Roman" w:hAnsi="Times New Roman" w:cs="Times New Roman"/>
                 <w:sz w:val="18"/>
                 <w:szCs w:val="18"/>
               </w:rPr>
@@ -9838,6 +8105,7 @@
             </w:pPr>
             <w:r>
               <w:rPr>
+                <w:rFonts w:ascii="Times New Roman" w:hAnsi="Times New Roman" w:cs="Times New Roman"/>
                 <w:sz w:val="18"/>
                 <w:szCs w:val="18"/>
               </w:rPr>
@@ -9869,6 +8137,7 @@
             </w:pPr>
             <w:r>
               <w:rPr>
+                <w:rFonts w:ascii="Times New Roman" w:hAnsi="Times New Roman" w:cs="Times New Roman"/>
                 <w:sz w:val="18"/>
                 <w:szCs w:val="18"/>
               </w:rPr>
@@ -9898,6 +8167,7 @@
             </w:pPr>
             <w:r>
               <w:rPr>
+                <w:rFonts w:ascii="Times New Roman" w:hAnsi="Times New Roman" w:cs="Times New Roman"/>
                 <w:sz w:val="18"/>
                 <w:szCs w:val="18"/>
               </w:rPr>
@@ -9929,6 +8199,7 @@
             </w:pPr>
             <w:r>
               <w:rPr>
+                <w:rFonts w:ascii="Times New Roman" w:hAnsi="Times New Roman" w:cs="Times New Roman"/>
                 <w:sz w:val="18"/>
                 <w:szCs w:val="18"/>
               </w:rPr>
@@ -9958,6 +8229,7 @@
             </w:pPr>
             <w:r>
               <w:rPr>
+                <w:rFonts w:ascii="Times New Roman" w:hAnsi="Times New Roman" w:cs="Times New Roman"/>
                 <w:sz w:val="18"/>
                 <w:szCs w:val="18"/>
               </w:rPr>
@@ -9989,6 +8261,7 @@
             </w:pPr>
             <w:r>
               <w:rPr>
+                <w:rFonts w:ascii="Times New Roman" w:hAnsi="Times New Roman" w:cs="Times New Roman"/>
                 <w:sz w:val="18"/>
                 <w:szCs w:val="18"/>
               </w:rPr>
@@ -10018,6 +8291,7 @@
             </w:pPr>
             <w:r>
               <w:rPr>
+                <w:rFonts w:ascii="Times New Roman" w:hAnsi="Times New Roman" w:cs="Times New Roman"/>
                 <w:sz w:val="18"/>
                 <w:szCs w:val="18"/>
               </w:rPr>
@@ -10033,6 +8307,7 @@
       </w:pPr>
       <w:r>
         <w:rPr>
+          <w:rFonts w:ascii="Times New Roman" w:hAnsi="Times New Roman" w:cs="Times New Roman"/>
           <w:i/>
           <w:iCs/>
           <w:sz w:val="18"/>
@@ -10044,7 +8319,7 @@
     <w:p/>
     <w:p>
       <w:pPr>
-        <w:spacing w:before="80" w:after="80"/>
+        <w:spacing w:before="80" w:after="80" w:line="360" w:lineRule="auto"/>
         <w:jc w:val="both"/>
         <w:rPr>
           <w:rFonts w:ascii="Times New Roman" w:hAnsi="Times New Roman" w:cs="Times New Roman"/>
@@ -10055,11 +8330,15 @@
       <w:r>
         <w:rPr>
           <w:rFonts w:ascii="Times New Roman" w:hAnsi="Times New Roman" w:cs="Times New Roman"/>
+          <w:sz w:val="24"/>
+          <w:szCs w:val="24"/>
         </w:rPr>
         <w:t>All values are reproducible from the analysis code (https://github.com/Ramesh2217/MONP-nanotox-audit; fixed seed 42, pinned software versions in requirements.txt). Deterministic results reproduce exactly; the random forest and multilayer perceptron use internal randomness and reproduce on the pinned environment. The MLP permutation test used 1,000 label permutations (observed MCC +0.166; null mean −0.003; two-sided p = 0.004).</w:t>
       </w:r>
     </w:p>
     <w:sectPr>
+      <w:headerReference w:type="default" r:id="rId11"/>
+      <w:footerReference w:type="default" r:id="rId12"/>
       <w:pgSz w:w="12240" w:h="15840"/>
       <w:pgMar w:top="1440" w:right="1440" w:bottom="1440" w:left="1440" w:header="708" w:footer="708" w:gutter="0"/>
       <w:cols w:space="720"/>
@@ -10067,6 +8346,26 @@
     </w:sectPr>
   </w:body>
 </w:document>
+</file>
+
+<file path=word/footer1.xml><?xml version="1.0" encoding="utf-8"?>
+<w:ftr xmlns:m="http://schemas.openxmlformats.org/officeDocument/2006/math" xmlns:mc="http://schemas.openxmlformats.org/markup-compatibility/2006" xmlns:mo="http://schemas.microsoft.com/office/mac/office/2008/main" xmlns:mv="urn:schemas-microsoft-com:mac:vml" xmlns:o="urn:schemas-microsoft-com:office:office" xmlns:r="http://schemas.openxmlformats.org/officeDocument/2006/relationships" xmlns:v="urn:schemas-microsoft-com:vml" xmlns:w10="urn:schemas-microsoft-com:office:word" xmlns:w14="http://schemas.microsoft.com/office/word/2010/wordml" xmlns:w="http://schemas.openxmlformats.org/wordprocessingml/2006/main" xmlns:wne="http://schemas.microsoft.com/office/word/2006/wordml" xmlns:wp14="http://schemas.microsoft.com/office/word/2010/wordprocessingDrawing" xmlns:wp="http://schemas.openxmlformats.org/drawingml/2006/wordprocessingDrawing" xmlns:wpc="http://schemas.microsoft.com/office/word/2010/wordprocessingCanvas" xmlns:wpg="http://schemas.microsoft.com/office/word/2010/wordprocessingGroup" xmlns:wpi="http://schemas.microsoft.com/office/word/2010/wordprocessingInk" xmlns:wps="http://schemas.microsoft.com/office/word/2010/wordprocessingShape" mc:Ignorable="w14 wp14">
+  <w:p>
+    <w:pPr>
+      <w:pStyle w:val="Footer"/>
+    </w:pPr>
+  </w:p>
+</w:ftr>
+</file>
+
+<file path=word/header1.xml><?xml version="1.0" encoding="utf-8"?>
+<w:hdr xmlns:m="http://schemas.openxmlformats.org/officeDocument/2006/math" xmlns:mc="http://schemas.openxmlformats.org/markup-compatibility/2006" xmlns:mo="http://schemas.microsoft.com/office/mac/office/2008/main" xmlns:mv="urn:schemas-microsoft-com:mac:vml" xmlns:o="urn:schemas-microsoft-com:office:office" xmlns:r="http://schemas.openxmlformats.org/officeDocument/2006/relationships" xmlns:v="urn:schemas-microsoft-com:vml" xmlns:w10="urn:schemas-microsoft-com:office:word" xmlns:w14="http://schemas.microsoft.com/office/word/2010/wordml" xmlns:w="http://schemas.openxmlformats.org/wordprocessingml/2006/main" xmlns:wne="http://schemas.microsoft.com/office/word/2006/wordml" xmlns:wp14="http://schemas.microsoft.com/office/word/2010/wordprocessingDrawing" xmlns:wp="http://schemas.openxmlformats.org/drawingml/2006/wordprocessingDrawing" xmlns:wpc="http://schemas.microsoft.com/office/word/2010/wordprocessingCanvas" xmlns:wpg="http://schemas.microsoft.com/office/word/2010/wordprocessingGroup" xmlns:wpi="http://schemas.microsoft.com/office/word/2010/wordprocessingInk" xmlns:wps="http://schemas.microsoft.com/office/word/2010/wordprocessingShape" mc:Ignorable="w14 wp14">
+  <w:p>
+    <w:pPr>
+      <w:pStyle w:val="Header"/>
+    </w:pPr>
+  </w:p>
+</w:hdr>
 </file>
 
 <file path=word/numbering.xml><?xml version="1.0" encoding="utf-8"?>
@@ -10171,7 +8470,7 @@
   <w:docDefaults>
     <w:rPrDefault>
       <w:rPr>
-        <w:rFonts w:ascii="Calibri" w:eastAsia="Calibri" w:hAnsi="Calibri" w:cs="Calibri"/>
+        <w:rFonts w:ascii="Times New Roman" w:eastAsia="Times New Roman" w:hAnsi="Times New Roman" w:cs="Times New Roman"/>
         <w:lang w:val="en-IN" w:eastAsia="en-IN" w:bidi="ar-SA"/>
       </w:rPr>
     </w:rPrDefault>

</xml_diff>